<commit_message>
Update portfolio content and templates
</commit_message>
<xml_diff>
--- a/assets/user-story-template.docx
+++ b/assets/user-story-template.docx
@@ -4,206 +4,59 @@
   <w:body>
     <w:p>
       <w:pPr>
-        <w:spacing w:after="80" w:line="276" w:lineRule="auto"/>
+        <w:spacing w:before="0" w:after="80" w:line="240" w:lineRule="auto"/>
+        <w:jc w:val="left"/>
       </w:pPr>
       <w:r>
         <w:rPr>
-          <w:rFonts w:ascii="Calibri" w:hAnsi="Calibri" w:eastAsia="Calibri"/>
+          <w:rFonts w:ascii="Calibri" w:hAnsi="Calibri"/>
           <w:b/>
+          <w:i w:val="0"/>
           <w:color w:val="2F8B57"/>
-          <w:sz w:val="18"/>
+          <w:sz w:val="19"/>
         </w:rPr>
-        <w:t>VIVIANE SANTOS | BUSINESS ANALYSIS</w:t>
+        <w:t>BUSINESS ANALYST WORKSHEET</w:t>
       </w:r>
     </w:p>
     <w:p>
       <w:pPr>
-        <w:pStyle w:val="Title"/>
+        <w:spacing w:before="0" w:after="120" w:line="228" w:lineRule="auto"/>
         <w:jc w:val="left"/>
       </w:pPr>
       <w:r>
         <w:rPr>
+          <w:rFonts w:ascii="Georgia" w:hAnsi="Georgia"/>
+          <w:b/>
+          <w:i w:val="0"/>
           <w:color w:val="111111"/>
+          <w:sz w:val="52"/>
         </w:rPr>
         <w:t>User Story Template</w:t>
       </w:r>
     </w:p>
     <w:p>
       <w:pPr>
-        <w:spacing w:after="200" w:line="276" w:lineRule="auto"/>
+        <w:spacing w:before="0" w:after="200" w:line="300" w:lineRule="auto"/>
+        <w:jc w:val="left"/>
       </w:pPr>
       <w:r>
         <w:rPr>
-          <w:rFonts w:ascii="Calibri" w:hAnsi="Calibri" w:eastAsia="Calibri"/>
+          <w:rFonts w:ascii="Calibri" w:hAnsi="Calibri"/>
+          <w:b w:val="0"/>
+          <w:i w:val="0"/>
           <w:color w:val="5F5A53"/>
-          <w:sz w:val="24"/>
+          <w:sz w:val="21"/>
         </w:rPr>
-        <w:t>A clean, reusable Word mask for writing user stories that are short, clear, and easy to explain in interviews or project workshops.</w:t>
+        <w:t>Use this form to draft one story at a time. Keep the prompts short, fill the fields, and delete the placeholder text before sending it to the team.</w:t>
       </w:r>
     </w:p>
     <w:tbl>
       <w:tblPr>
-        <w:tblW w:type="auto" w:w="0"/>
-        <w:jc w:val="left"/>
+        <w:tblW w:type="dxa" w:w="9360"/>
+        <w:jc w:val="center"/>
         <w:tblLayout w:type="fixed"/>
         <w:tblLook w:firstColumn="1" w:firstRow="1" w:lastColumn="0" w:lastRow="0" w:noHBand="0" w:noVBand="1" w:val="04A0"/>
-        <w:tblBorders>
-          <w:top w:val="single" w:sz="8" w:space="0" w:color="BFB8AE"/>
-          <w:left w:val="single" w:sz="8" w:space="0" w:color="BFB8AE"/>
-          <w:bottom w:val="single" w:sz="8" w:space="0" w:color="BFB8AE"/>
-          <w:right w:val="single" w:sz="8" w:space="0" w:color="BFB8AE"/>
-          <w:insideH w:val="single" w:sz="8" w:space="0" w:color="BFB8AE"/>
-          <w:insideV w:val="single" w:sz="8" w:space="0" w:color="BFB8AE"/>
-        </w:tblBorders>
-      </w:tblPr>
-      <w:tblGrid>
-        <w:gridCol w:w="9360"/>
-      </w:tblGrid>
-      <w:tr>
-        <w:tc>
-          <w:tcPr>
-            <w:tcW w:type="dxa" w:w="9360"/>
-            <w:shd w:fill="F4F6F9"/>
-            <w:tcMar>
-              <w:top w:w="120" w:type="dxa"/>
-              <w:start w:w="160" w:type="dxa"/>
-              <w:bottom w:w="120" w:type="dxa"/>
-              <w:end w:w="160" w:type="dxa"/>
-            </w:tcMar>
-          </w:tcPr>
-          <w:p>
-            <w:pPr>
-              <w:spacing w:after="0" w:before="0" w:line="276" w:lineRule="auto"/>
-              <w:jc w:val="left"/>
-            </w:pPr>
-            <w:r/>
-            <w:r>
-              <w:rPr>
-                <w:rFonts w:ascii="Calibri" w:hAnsi="Calibri" w:eastAsia="Calibri"/>
-                <w:b w:val="0"/>
-                <w:i w:val="0"/>
-                <w:color w:val="111111"/>
-                <w:sz w:val="22"/>
-              </w:rPr>
-              <w:t>Use this template when you need to go from a business request to a concise user story with clear acceptance criteria.</w:t>
-            </w:r>
-          </w:p>
-        </w:tc>
-      </w:tr>
-    </w:tbl>
-    <w:p/>
-    <w:p>
-      <w:pPr>
-        <w:pStyle w:val="Heading1"/>
-      </w:pPr>
-      <w:r>
-        <w:t>How to think about a user story</w:t>
-      </w:r>
-    </w:p>
-    <w:p>
-      <w:pPr>
-        <w:pStyle w:val="ListNumber"/>
-        <w:spacing w:after="80"/>
-      </w:pPr>
-      <w:r>
-        <w:rPr>
-          <w:rFonts w:ascii="Calibri" w:hAnsi="Calibri" w:eastAsia="Calibri"/>
-          <w:sz w:val="22"/>
-        </w:rPr>
-        <w:t>Start with the user or persona, not the solution.</w:t>
-      </w:r>
-    </w:p>
-    <w:p>
-      <w:pPr>
-        <w:pStyle w:val="ListNumber"/>
-        <w:spacing w:after="80"/>
-      </w:pPr>
-      <w:r>
-        <w:rPr>
-          <w:rFonts w:ascii="Calibri" w:hAnsi="Calibri" w:eastAsia="Calibri"/>
-          <w:sz w:val="22"/>
-        </w:rPr>
-        <w:t>Describe the goal and the business value in one sentence.</w:t>
-      </w:r>
-    </w:p>
-    <w:p>
-      <w:pPr>
-        <w:pStyle w:val="ListNumber"/>
-        <w:spacing w:after="80"/>
-      </w:pPr>
-      <w:r>
-        <w:rPr>
-          <w:rFonts w:ascii="Calibri" w:hAnsi="Calibri" w:eastAsia="Calibri"/>
-          <w:sz w:val="22"/>
-        </w:rPr>
-        <w:t>Keep acceptance criteria testable and small enough to review quickly.</w:t>
-      </w:r>
-    </w:p>
-    <w:tbl>
-      <w:tblPr>
-        <w:tblW w:type="auto" w:w="0"/>
-        <w:jc w:val="left"/>
-        <w:tblLayout w:type="fixed"/>
-        <w:tblLook w:firstColumn="1" w:firstRow="1" w:lastColumn="0" w:lastRow="0" w:noHBand="0" w:noVBand="1" w:val="04A0"/>
-        <w:tblBorders>
-          <w:top w:val="single" w:sz="10" w:space="0" w:color="67D98F"/>
-          <w:left w:val="single" w:sz="10" w:space="0" w:color="67D98F"/>
-          <w:bottom w:val="single" w:sz="10" w:space="0" w:color="67D98F"/>
-          <w:right w:val="single" w:sz="10" w:space="0" w:color="67D98F"/>
-          <w:insideH w:val="single" w:sz="10" w:space="0" w:color="67D98F"/>
-          <w:insideV w:val="single" w:sz="10" w:space="0" w:color="67D98F"/>
-        </w:tblBorders>
-      </w:tblPr>
-      <w:tblGrid>
-        <w:gridCol w:w="9360"/>
-      </w:tblGrid>
-      <w:tr>
-        <w:tc>
-          <w:tcPr>
-            <w:tcW w:type="dxa" w:w="9360"/>
-            <w:shd w:fill="EDF9F0"/>
-            <w:tcMar>
-              <w:top w:w="120" w:type="dxa"/>
-              <w:start w:w="160" w:type="dxa"/>
-              <w:bottom w:w="120" w:type="dxa"/>
-              <w:end w:w="160" w:type="dxa"/>
-            </w:tcMar>
-          </w:tcPr>
-          <w:p>
-            <w:pPr>
-              <w:spacing w:after="0" w:before="0" w:line="276" w:lineRule="auto"/>
-              <w:jc w:val="left"/>
-            </w:pPr>
-            <w:r/>
-            <w:r>
-              <w:rPr>
-                <w:rFonts w:ascii="Calibri" w:hAnsi="Calibri" w:eastAsia="Calibri"/>
-                <w:b/>
-                <w:i w:val="0"/>
-                <w:color w:val="2F8B57"/>
-                <w:sz w:val="22"/>
-              </w:rPr>
-              <w:t>Core formula: As a [user/persona], I want [goal], so that [benefit].</w:t>
-            </w:r>
-          </w:p>
-        </w:tc>
-      </w:tr>
-    </w:tbl>
-    <w:p/>
-    <w:p>
-      <w:pPr>
-        <w:pStyle w:val="Heading1"/>
-      </w:pPr>
-      <w:r>
-        <w:t>Example</w:t>
-      </w:r>
-    </w:p>
-    <w:tbl>
-      <w:tblPr>
-        <w:tblW w:type="auto" w:w="0"/>
-        <w:jc w:val="left"/>
-        <w:tblLayout w:type="fixed"/>
-        <w:tblLook w:firstColumn="1" w:firstRow="1" w:lastColumn="0" w:lastRow="0" w:noHBand="0" w:noVBand="1" w:val="04A0"/>
+        <w:tblInd w:w="120" w:type="dxa"/>
         <w:tblBorders>
           <w:top w:val="single" w:sz="8" w:space="0" w:color="D9D5CE"/>
           <w:left w:val="single" w:sz="8" w:space="0" w:color="D9D5CE"/>
@@ -214,35 +67,129 @@
         </w:tblBorders>
       </w:tblPr>
       <w:tblGrid>
-        <w:gridCol w:w="9360"/>
+        <w:gridCol w:w="1512"/>
+        <w:gridCol w:w="3168"/>
+        <w:gridCol w:w="1512"/>
+        <w:gridCol w:w="3168"/>
       </w:tblGrid>
       <w:tr>
         <w:tc>
           <w:tcPr>
-            <w:tcW w:type="dxa" w:w="9360"/>
-            <w:shd w:fill="FBFAF7"/>
+            <w:tcW w:type="dxa" w:w="1512"/>
             <w:tcMar>
-              <w:top w:w="120" w:type="dxa"/>
-              <w:start w:w="160" w:type="dxa"/>
-              <w:bottom w:w="120" w:type="dxa"/>
-              <w:end w:w="160" w:type="dxa"/>
+              <w:top w:w="80" w:type="dxa"/>
+              <w:start w:w="120" w:type="dxa"/>
+              <w:bottom w:w="80" w:type="dxa"/>
+              <w:end w:w="120" w:type="dxa"/>
             </w:tcMar>
+            <w:vAlign w:val="top"/>
+            <w:shd w:fill="F2EFE9"/>
           </w:tcPr>
           <w:p>
             <w:pPr>
-              <w:spacing w:after="0" w:before="0" w:line="276" w:lineRule="auto"/>
+              <w:spacing w:before="0" w:after="0" w:line="276" w:lineRule="auto"/>
               <w:jc w:val="left"/>
             </w:pPr>
             <w:r/>
             <w:r>
               <w:rPr>
-                <w:rFonts w:ascii="Calibri" w:hAnsi="Calibri" w:eastAsia="Calibri"/>
+                <w:rFonts w:ascii="Calibri" w:hAnsi="Calibri"/>
+                <w:b/>
+                <w:i w:val="0"/>
+                <w:color w:val="2F8B57"/>
+                <w:sz w:val="18"/>
+              </w:rPr>
+              <w:t>Story ID</w:t>
+            </w:r>
+          </w:p>
+        </w:tc>
+        <w:tc>
+          <w:tcPr>
+            <w:tcW w:type="dxa" w:w="3168"/>
+            <w:tcMar>
+              <w:top w:w="80" w:type="dxa"/>
+              <w:start w:w="120" w:type="dxa"/>
+              <w:bottom w:w="80" w:type="dxa"/>
+              <w:end w:w="120" w:type="dxa"/>
+            </w:tcMar>
+            <w:vAlign w:val="top"/>
+            <w:shd w:fill="FBFAF7"/>
+          </w:tcPr>
+          <w:p>
+            <w:pPr>
+              <w:spacing w:before="0" w:after="0" w:line="276" w:lineRule="auto"/>
+              <w:jc w:val="left"/>
+            </w:pPr>
+            <w:r/>
+            <w:r>
+              <w:rPr>
+                <w:rFonts w:ascii="Calibri" w:hAnsi="Calibri"/>
                 <w:b w:val="0"/>
+                <w:i/>
+                <w:color w:val="5F5A53"/>
+                <w:sz w:val="20"/>
+              </w:rPr>
+              <w:t>[US-001]</w:t>
+            </w:r>
+          </w:p>
+        </w:tc>
+        <w:tc>
+          <w:tcPr>
+            <w:tcW w:type="dxa" w:w="1512"/>
+            <w:tcMar>
+              <w:top w:w="80" w:type="dxa"/>
+              <w:start w:w="120" w:type="dxa"/>
+              <w:bottom w:w="80" w:type="dxa"/>
+              <w:end w:w="120" w:type="dxa"/>
+            </w:tcMar>
+            <w:vAlign w:val="top"/>
+            <w:shd w:fill="F2EFE9"/>
+          </w:tcPr>
+          <w:p>
+            <w:pPr>
+              <w:spacing w:before="0" w:after="0" w:line="276" w:lineRule="auto"/>
+              <w:jc w:val="left"/>
+            </w:pPr>
+            <w:r/>
+            <w:r>
+              <w:rPr>
+                <w:rFonts w:ascii="Calibri" w:hAnsi="Calibri"/>
+                <w:b/>
                 <w:i w:val="0"/>
-                <w:color w:val="111111"/>
-                <w:sz w:val="22"/>
+                <w:color w:val="2F8B57"/>
+                <w:sz w:val="18"/>
               </w:rPr>
-              <w:t>Story: As a customer service agent, I want to see the last five interactions with a client, so that I can answer questions faster and give better support.</w:t>
+              <w:t>Owner</w:t>
+            </w:r>
+          </w:p>
+        </w:tc>
+        <w:tc>
+          <w:tcPr>
+            <w:tcW w:type="dxa" w:w="3168"/>
+            <w:tcMar>
+              <w:top w:w="80" w:type="dxa"/>
+              <w:start w:w="120" w:type="dxa"/>
+              <w:bottom w:w="80" w:type="dxa"/>
+              <w:end w:w="120" w:type="dxa"/>
+            </w:tcMar>
+            <w:vAlign w:val="top"/>
+            <w:shd w:fill="FBFAF7"/>
+          </w:tcPr>
+          <w:p>
+            <w:pPr>
+              <w:spacing w:before="0" w:after="0" w:line="276" w:lineRule="auto"/>
+              <w:jc w:val="left"/>
+            </w:pPr>
+            <w:r/>
+            <w:r>
+              <w:rPr>
+                <w:rFonts w:ascii="Calibri" w:hAnsi="Calibri"/>
+                <w:b w:val="0"/>
+                <w:i/>
+                <w:color w:val="5F5A53"/>
+                <w:sz w:val="20"/>
+              </w:rPr>
+              <w:t>[name]</w:t>
             </w:r>
           </w:p>
         </w:tc>
@@ -250,81 +197,287 @@
       <w:tr>
         <w:tc>
           <w:tcPr>
-            <w:tcW w:type="dxa" w:w="9360"/>
-            <w:shd w:fill="FBFAF7"/>
+            <w:tcW w:type="dxa" w:w="1512"/>
             <w:tcMar>
-              <w:top w:w="120" w:type="dxa"/>
-              <w:start w:w="160" w:type="dxa"/>
-              <w:bottom w:w="120" w:type="dxa"/>
-              <w:end w:w="160" w:type="dxa"/>
+              <w:top w:w="80" w:type="dxa"/>
+              <w:start w:w="120" w:type="dxa"/>
+              <w:bottom w:w="80" w:type="dxa"/>
+              <w:end w:w="120" w:type="dxa"/>
             </w:tcMar>
+            <w:vAlign w:val="top"/>
+            <w:shd w:fill="F2EFE9"/>
           </w:tcPr>
           <w:p>
             <w:pPr>
-              <w:spacing w:after="0" w:before="0" w:line="276" w:lineRule="auto"/>
+              <w:spacing w:before="0" w:after="0" w:line="276" w:lineRule="auto"/>
               <w:jc w:val="left"/>
             </w:pPr>
             <w:r/>
             <w:r>
               <w:rPr>
-                <w:rFonts w:ascii="Calibri" w:hAnsi="Calibri" w:eastAsia="Calibri"/>
+                <w:rFonts w:ascii="Calibri" w:hAnsi="Calibri"/>
+                <w:b/>
+                <w:i w:val="0"/>
+                <w:color w:val="2F8B57"/>
+                <w:sz w:val="18"/>
+              </w:rPr>
+              <w:t>Priority</w:t>
+            </w:r>
+          </w:p>
+        </w:tc>
+        <w:tc>
+          <w:tcPr>
+            <w:tcW w:type="dxa" w:w="3168"/>
+            <w:tcMar>
+              <w:top w:w="80" w:type="dxa"/>
+              <w:start w:w="120" w:type="dxa"/>
+              <w:bottom w:w="80" w:type="dxa"/>
+              <w:end w:w="120" w:type="dxa"/>
+            </w:tcMar>
+            <w:vAlign w:val="top"/>
+            <w:shd w:fill="FBFAF7"/>
+          </w:tcPr>
+          <w:p>
+            <w:pPr>
+              <w:spacing w:before="0" w:after="0" w:line="276" w:lineRule="auto"/>
+              <w:jc w:val="left"/>
+            </w:pPr>
+            <w:r/>
+            <w:r>
+              <w:rPr>
+                <w:rFonts w:ascii="Calibri" w:hAnsi="Calibri"/>
                 <w:b w:val="0"/>
+                <w:i/>
+                <w:color w:val="5F5A53"/>
+                <w:sz w:val="20"/>
+              </w:rPr>
+              <w:t>[High / Med / Low]</w:t>
+            </w:r>
+          </w:p>
+        </w:tc>
+        <w:tc>
+          <w:tcPr>
+            <w:tcW w:type="dxa" w:w="1512"/>
+            <w:tcMar>
+              <w:top w:w="80" w:type="dxa"/>
+              <w:start w:w="120" w:type="dxa"/>
+              <w:bottom w:w="80" w:type="dxa"/>
+              <w:end w:w="120" w:type="dxa"/>
+            </w:tcMar>
+            <w:vAlign w:val="top"/>
+            <w:shd w:fill="F2EFE9"/>
+          </w:tcPr>
+          <w:p>
+            <w:pPr>
+              <w:spacing w:before="0" w:after="0" w:line="276" w:lineRule="auto"/>
+              <w:jc w:val="left"/>
+            </w:pPr>
+            <w:r/>
+            <w:r>
+              <w:rPr>
+                <w:rFonts w:ascii="Calibri" w:hAnsi="Calibri"/>
+                <w:b/>
                 <w:i w:val="0"/>
-                <w:color w:val="111111"/>
-                <w:sz w:val="22"/>
+                <w:color w:val="2F8B57"/>
+                <w:sz w:val="18"/>
               </w:rPr>
-              <w:t>Acceptance criteria: 1) last five interactions are visible, 2) ordered by most recent, 3) easy to read and validate.</w:t>
+              <w:t>Status</w:t>
+            </w:r>
+          </w:p>
+        </w:tc>
+        <w:tc>
+          <w:tcPr>
+            <w:tcW w:type="dxa" w:w="3168"/>
+            <w:tcMar>
+              <w:top w:w="80" w:type="dxa"/>
+              <w:start w:w="120" w:type="dxa"/>
+              <w:bottom w:w="80" w:type="dxa"/>
+              <w:end w:w="120" w:type="dxa"/>
+            </w:tcMar>
+            <w:vAlign w:val="top"/>
+            <w:shd w:fill="FBFAF7"/>
+          </w:tcPr>
+          <w:p>
+            <w:pPr>
+              <w:spacing w:before="0" w:after="0" w:line="276" w:lineRule="auto"/>
+              <w:jc w:val="left"/>
+            </w:pPr>
+            <w:r/>
+            <w:r>
+              <w:rPr>
+                <w:rFonts w:ascii="Calibri" w:hAnsi="Calibri"/>
+                <w:b w:val="0"/>
+                <w:i/>
+                <w:color w:val="5F5A53"/>
+                <w:sz w:val="20"/>
+              </w:rPr>
+              <w:t>[Draft / Review / Final]</w:t>
+            </w:r>
+          </w:p>
+        </w:tc>
+      </w:tr>
+      <w:tr>
+        <w:tc>
+          <w:tcPr>
+            <w:tcW w:type="dxa" w:w="1512"/>
+            <w:tcMar>
+              <w:top w:w="80" w:type="dxa"/>
+              <w:start w:w="120" w:type="dxa"/>
+              <w:bottom w:w="80" w:type="dxa"/>
+              <w:end w:w="120" w:type="dxa"/>
+            </w:tcMar>
+            <w:vAlign w:val="top"/>
+            <w:shd w:fill="F2EFE9"/>
+          </w:tcPr>
+          <w:p>
+            <w:pPr>
+              <w:spacing w:before="0" w:after="0" w:line="276" w:lineRule="auto"/>
+              <w:jc w:val="left"/>
+            </w:pPr>
+            <w:r/>
+            <w:r>
+              <w:rPr>
+                <w:rFonts w:ascii="Calibri" w:hAnsi="Calibri"/>
+                <w:b/>
+                <w:i w:val="0"/>
+                <w:color w:val="2F8B57"/>
+                <w:sz w:val="18"/>
+              </w:rPr>
+              <w:t>Area</w:t>
+            </w:r>
+          </w:p>
+        </w:tc>
+        <w:tc>
+          <w:tcPr>
+            <w:tcW w:type="dxa" w:w="3168"/>
+            <w:tcMar>
+              <w:top w:w="80" w:type="dxa"/>
+              <w:start w:w="120" w:type="dxa"/>
+              <w:bottom w:w="80" w:type="dxa"/>
+              <w:end w:w="120" w:type="dxa"/>
+            </w:tcMar>
+            <w:vAlign w:val="top"/>
+            <w:shd w:fill="FBFAF7"/>
+          </w:tcPr>
+          <w:p>
+            <w:pPr>
+              <w:spacing w:before="0" w:after="0" w:line="276" w:lineRule="auto"/>
+              <w:jc w:val="left"/>
+            </w:pPr>
+            <w:r/>
+            <w:r>
+              <w:rPr>
+                <w:rFonts w:ascii="Calibri" w:hAnsi="Calibri"/>
+                <w:b w:val="0"/>
+                <w:i/>
+                <w:color w:val="5F5A53"/>
+                <w:sz w:val="20"/>
+              </w:rPr>
+              <w:t>[project / product / process]</w:t>
+            </w:r>
+          </w:p>
+        </w:tc>
+        <w:tc>
+          <w:tcPr>
+            <w:tcW w:type="dxa" w:w="1512"/>
+            <w:tcMar>
+              <w:top w:w="80" w:type="dxa"/>
+              <w:start w:w="120" w:type="dxa"/>
+              <w:bottom w:w="80" w:type="dxa"/>
+              <w:end w:w="120" w:type="dxa"/>
+            </w:tcMar>
+            <w:vAlign w:val="top"/>
+            <w:shd w:fill="F2EFE9"/>
+          </w:tcPr>
+          <w:p>
+            <w:pPr>
+              <w:spacing w:before="0" w:after="0" w:line="276" w:lineRule="auto"/>
+              <w:jc w:val="left"/>
+            </w:pPr>
+            <w:r/>
+            <w:r>
+              <w:rPr>
+                <w:rFonts w:ascii="Calibri" w:hAnsi="Calibri"/>
+                <w:b/>
+                <w:i w:val="0"/>
+                <w:color w:val="2F8B57"/>
+                <w:sz w:val="18"/>
+              </w:rPr>
+              <w:t>Date</w:t>
+            </w:r>
+          </w:p>
+        </w:tc>
+        <w:tc>
+          <w:tcPr>
+            <w:tcW w:type="dxa" w:w="3168"/>
+            <w:tcMar>
+              <w:top w:w="80" w:type="dxa"/>
+              <w:start w:w="120" w:type="dxa"/>
+              <w:bottom w:w="80" w:type="dxa"/>
+              <w:end w:w="120" w:type="dxa"/>
+            </w:tcMar>
+            <w:vAlign w:val="top"/>
+            <w:shd w:fill="FBFAF7"/>
+          </w:tcPr>
+          <w:p>
+            <w:pPr>
+              <w:spacing w:before="0" w:after="0" w:line="276" w:lineRule="auto"/>
+              <w:jc w:val="left"/>
+            </w:pPr>
+            <w:r/>
+            <w:r>
+              <w:rPr>
+                <w:rFonts w:ascii="Calibri" w:hAnsi="Calibri"/>
+                <w:b w:val="0"/>
+                <w:i/>
+                <w:color w:val="5F5A53"/>
+                <w:sz w:val="20"/>
+              </w:rPr>
+              <w:t>[dd / mm / yyyy]</w:t>
             </w:r>
           </w:p>
         </w:tc>
       </w:tr>
     </w:tbl>
     <w:p>
+      <w:pPr>
+        <w:spacing w:before="0" w:after="80" w:line="240" w:lineRule="auto"/>
+        <w:jc w:val="left"/>
+      </w:pPr>
       <w:r>
-        <w:br w:type="page"/>
+        <w:rPr>
+          <w:rFonts w:ascii="Calibri" w:hAnsi="Calibri"/>
+          <w:b/>
+          <w:i w:val="0"/>
+          <w:color w:val="2F8B57"/>
+          <w:sz w:val="19"/>
+        </w:rPr>
+        <w:t>Story statement</w:t>
       </w:r>
     </w:p>
     <w:p>
       <w:pPr>
-        <w:spacing w:after="80" w:line="276" w:lineRule="auto"/>
+        <w:spacing w:before="0" w:after="200" w:line="288" w:lineRule="auto"/>
+        <w:jc w:val="left"/>
       </w:pPr>
       <w:r>
         <w:rPr>
-          <w:rFonts w:ascii="Calibri" w:hAnsi="Calibri" w:eastAsia="Calibri"/>
-          <w:b/>
-          <w:color w:val="2F8B57"/>
-          <w:sz w:val="18"/>
+          <w:rFonts w:ascii="Calibri" w:hAnsi="Calibri"/>
+          <w:b w:val="0"/>
+          <w:i w:val="0"/>
+          <w:color w:val="5F5A53"/>
+          <w:sz w:val="21"/>
         </w:rPr>
-        <w:t>VIVIANE SANTOS | BUSINESS ANALYSIS</w:t>
-      </w:r>
-    </w:p>
-    <w:p>
-      <w:pPr>
-        <w:pStyle w:val="Heading1"/>
-      </w:pPr>
-      <w:r>
-        <w:t>Fill-in template</w:t>
-      </w:r>
-    </w:p>
-    <w:p>
-      <w:pPr>
-        <w:spacing w:after="200" w:line="276" w:lineRule="auto"/>
-      </w:pPr>
-      <w:r>
-        <w:rPr>
-          <w:rFonts w:ascii="Calibri" w:hAnsi="Calibri" w:eastAsia="Calibri"/>
-          <w:color w:val="5F5A53"/>
-          <w:sz w:val="22"/>
-        </w:rPr>
-        <w:t>Replace the prompts on the right with the real story details. Keep it short, specific, and easy to review.</w:t>
+        <w:t>Fill the three prompts below. This is the core of the story.</w:t>
       </w:r>
     </w:p>
     <w:tbl>
       <w:tblPr>
-        <w:tblW w:type="auto" w:w="0"/>
-        <w:jc w:val="left"/>
+        <w:tblW w:type="dxa" w:w="9360"/>
+        <w:jc w:val="center"/>
         <w:tblLayout w:type="fixed"/>
         <w:tblLook w:firstColumn="1" w:firstRow="1" w:lastColumn="0" w:lastRow="0" w:noHBand="0" w:noVBand="1" w:val="04A0"/>
+        <w:tblInd w:w="120" w:type="dxa"/>
         <w:tblBorders>
           <w:top w:val="single" w:sz="8" w:space="0" w:color="D9D5CE"/>
           <w:left w:val="single" w:sz="8" w:space="0" w:color="D9D5CE"/>
@@ -335,40 +488,516 @@
         </w:tblBorders>
       </w:tblPr>
       <w:tblGrid>
-        <w:gridCol w:w="4680"/>
-        <w:gridCol w:w="4680"/>
+        <w:gridCol w:w="1800"/>
+        <w:gridCol w:w="7560"/>
       </w:tblGrid>
       <w:tr>
-        <w:trPr>
-          <w:tblHeader w:val="true"/>
-        </w:trPr>
         <w:tc>
           <w:tcPr>
-            <w:tcW w:type="dxa" w:w="2664"/>
+            <w:tcW w:type="dxa" w:w="1800"/>
             <w:tcMar>
-              <w:top w:w="100" w:type="dxa"/>
+              <w:top w:w="80" w:type="dxa"/>
               <w:start w:w="120" w:type="dxa"/>
-              <w:bottom w:w="100" w:type="dxa"/>
+              <w:bottom w:w="80" w:type="dxa"/>
               <w:end w:w="120" w:type="dxa"/>
             </w:tcMar>
-            <w:shd w:fill="F2F4F7"/>
-            <w:vAlign w:val="center"/>
+            <w:vAlign w:val="top"/>
+            <w:shd w:fill="F2EFE9"/>
           </w:tcPr>
           <w:p>
             <w:pPr>
-              <w:spacing w:after="0" w:before="0" w:line="276" w:lineRule="auto"/>
+              <w:spacing w:before="0" w:after="0" w:line="276" w:lineRule="auto"/>
               <w:jc w:val="left"/>
             </w:pPr>
             <w:r/>
             <w:r>
               <w:rPr>
-                <w:rFonts w:ascii="Calibri" w:hAnsi="Calibri" w:eastAsia="Calibri"/>
+                <w:rFonts w:ascii="Calibri" w:hAnsi="Calibri"/>
                 <w:b/>
                 <w:i w:val="0"/>
-                <w:color w:val="1F4D78"/>
-                <w:sz w:val="22"/>
+                <w:color w:val="2F8B57"/>
+                <w:sz w:val="19"/>
               </w:rPr>
-              <w:t>Story title</w:t>
+              <w:t>As a</w:t>
+            </w:r>
+          </w:p>
+        </w:tc>
+        <w:tc>
+          <w:tcPr>
+            <w:tcW w:type="dxa" w:w="7560"/>
+            <w:tcMar>
+              <w:top w:w="80" w:type="dxa"/>
+              <w:start w:w="120" w:type="dxa"/>
+              <w:bottom w:w="80" w:type="dxa"/>
+              <w:end w:w="120" w:type="dxa"/>
+            </w:tcMar>
+            <w:vAlign w:val="top"/>
+            <w:shd w:fill="FBFAF7"/>
+          </w:tcPr>
+          <w:p>
+            <w:pPr>
+              <w:spacing w:before="0" w:after="0" w:line="276" w:lineRule="auto"/>
+              <w:jc w:val="left"/>
+            </w:pPr>
+            <w:r/>
+            <w:r>
+              <w:rPr>
+                <w:rFonts w:ascii="Calibri" w:hAnsi="Calibri"/>
+                <w:b w:val="0"/>
+                <w:i/>
+                <w:color w:val="5F5A53"/>
+                <w:sz w:val="20"/>
+              </w:rPr>
+              <w:t>[user or persona]</w:t>
+            </w:r>
+          </w:p>
+        </w:tc>
+      </w:tr>
+      <w:tr>
+        <w:tc>
+          <w:tcPr>
+            <w:tcW w:type="dxa" w:w="1800"/>
+            <w:tcMar>
+              <w:top w:w="80" w:type="dxa"/>
+              <w:start w:w="120" w:type="dxa"/>
+              <w:bottom w:w="80" w:type="dxa"/>
+              <w:end w:w="120" w:type="dxa"/>
+            </w:tcMar>
+            <w:vAlign w:val="top"/>
+            <w:shd w:fill="F2EFE9"/>
+          </w:tcPr>
+          <w:p>
+            <w:pPr>
+              <w:spacing w:before="0" w:after="0" w:line="276" w:lineRule="auto"/>
+              <w:jc w:val="left"/>
+            </w:pPr>
+            <w:r/>
+            <w:r>
+              <w:rPr>
+                <w:rFonts w:ascii="Calibri" w:hAnsi="Calibri"/>
+                <w:b/>
+                <w:i w:val="0"/>
+                <w:color w:val="2F8B57"/>
+                <w:sz w:val="19"/>
+              </w:rPr>
+              <w:t>I want</w:t>
+            </w:r>
+          </w:p>
+        </w:tc>
+        <w:tc>
+          <w:tcPr>
+            <w:tcW w:type="dxa" w:w="7560"/>
+            <w:tcMar>
+              <w:top w:w="80" w:type="dxa"/>
+              <w:start w:w="120" w:type="dxa"/>
+              <w:bottom w:w="80" w:type="dxa"/>
+              <w:end w:w="120" w:type="dxa"/>
+            </w:tcMar>
+            <w:vAlign w:val="top"/>
+            <w:shd w:fill="FBFAF7"/>
+          </w:tcPr>
+          <w:p>
+            <w:pPr>
+              <w:spacing w:before="0" w:after="0" w:line="276" w:lineRule="auto"/>
+              <w:jc w:val="left"/>
+            </w:pPr>
+            <w:r/>
+            <w:r>
+              <w:rPr>
+                <w:rFonts w:ascii="Calibri" w:hAnsi="Calibri"/>
+                <w:b w:val="0"/>
+                <w:i/>
+                <w:color w:val="5F5A53"/>
+                <w:sz w:val="20"/>
+              </w:rPr>
+              <w:t>[action or need]</w:t>
+            </w:r>
+          </w:p>
+        </w:tc>
+      </w:tr>
+      <w:tr>
+        <w:tc>
+          <w:tcPr>
+            <w:tcW w:type="dxa" w:w="1800"/>
+            <w:tcMar>
+              <w:top w:w="80" w:type="dxa"/>
+              <w:start w:w="120" w:type="dxa"/>
+              <w:bottom w:w="80" w:type="dxa"/>
+              <w:end w:w="120" w:type="dxa"/>
+            </w:tcMar>
+            <w:vAlign w:val="top"/>
+            <w:shd w:fill="F2EFE9"/>
+          </w:tcPr>
+          <w:p>
+            <w:pPr>
+              <w:spacing w:before="0" w:after="0" w:line="276" w:lineRule="auto"/>
+              <w:jc w:val="left"/>
+            </w:pPr>
+            <w:r/>
+            <w:r>
+              <w:rPr>
+                <w:rFonts w:ascii="Calibri" w:hAnsi="Calibri"/>
+                <w:b/>
+                <w:i w:val="0"/>
+                <w:color w:val="2F8B57"/>
+                <w:sz w:val="19"/>
+              </w:rPr>
+              <w:t>So that</w:t>
+            </w:r>
+          </w:p>
+        </w:tc>
+        <w:tc>
+          <w:tcPr>
+            <w:tcW w:type="dxa" w:w="7560"/>
+            <w:tcMar>
+              <w:top w:w="80" w:type="dxa"/>
+              <w:start w:w="120" w:type="dxa"/>
+              <w:bottom w:w="80" w:type="dxa"/>
+              <w:end w:w="120" w:type="dxa"/>
+            </w:tcMar>
+            <w:vAlign w:val="top"/>
+            <w:shd w:fill="FBFAF7"/>
+          </w:tcPr>
+          <w:p>
+            <w:pPr>
+              <w:spacing w:before="0" w:after="0" w:line="276" w:lineRule="auto"/>
+              <w:jc w:val="left"/>
+            </w:pPr>
+            <w:r/>
+            <w:r>
+              <w:rPr>
+                <w:rFonts w:ascii="Calibri" w:hAnsi="Calibri"/>
+                <w:b w:val="0"/>
+                <w:i/>
+                <w:color w:val="5F5A53"/>
+                <w:sz w:val="20"/>
+              </w:rPr>
+              <w:t>[business value]</w:t>
+            </w:r>
+          </w:p>
+        </w:tc>
+      </w:tr>
+    </w:tbl>
+    <w:p>
+      <w:pPr>
+        <w:spacing w:before="0" w:after="80" w:line="240" w:lineRule="auto"/>
+        <w:jc w:val="left"/>
+      </w:pPr>
+      <w:r>
+        <w:rPr>
+          <w:rFonts w:ascii="Calibri" w:hAnsi="Calibri"/>
+          <w:b/>
+          <w:i w:val="0"/>
+          <w:color w:val="2F8B57"/>
+          <w:sz w:val="19"/>
+        </w:rPr>
+        <w:t>Context</w:t>
+      </w:r>
+    </w:p>
+    <w:p>
+      <w:pPr>
+        <w:spacing w:before="0" w:after="200" w:line="288" w:lineRule="auto"/>
+        <w:jc w:val="left"/>
+      </w:pPr>
+      <w:r>
+        <w:rPr>
+          <w:rFonts w:ascii="Calibri" w:hAnsi="Calibri"/>
+          <w:b w:val="0"/>
+          <w:i w:val="0"/>
+          <w:color w:val="5F5A53"/>
+          <w:sz w:val="21"/>
+        </w:rPr>
+        <w:t>Use short notes only. Add more detail in comments if needed.</w:t>
+      </w:r>
+    </w:p>
+    <w:tbl>
+      <w:tblPr>
+        <w:tblW w:type="dxa" w:w="9360"/>
+        <w:jc w:val="center"/>
+        <w:tblLayout w:type="fixed"/>
+        <w:tblLook w:firstColumn="1" w:firstRow="1" w:lastColumn="0" w:lastRow="0" w:noHBand="0" w:noVBand="1" w:val="04A0"/>
+        <w:tblInd w:w="120" w:type="dxa"/>
+        <w:tblBorders>
+          <w:top w:val="single" w:sz="8" w:space="0" w:color="D9D5CE"/>
+          <w:left w:val="single" w:sz="8" w:space="0" w:color="D9D5CE"/>
+          <w:bottom w:val="single" w:sz="8" w:space="0" w:color="D9D5CE"/>
+          <w:right w:val="single" w:sz="8" w:space="0" w:color="D9D5CE"/>
+          <w:insideH w:val="single" w:sz="8" w:space="0" w:color="D9D5CE"/>
+          <w:insideV w:val="single" w:sz="8" w:space="0" w:color="D9D5CE"/>
+        </w:tblBorders>
+      </w:tblPr>
+      <w:tblGrid>
+        <w:gridCol w:w="1800"/>
+        <w:gridCol w:w="7560"/>
+      </w:tblGrid>
+      <w:tr>
+        <w:tc>
+          <w:tcPr>
+            <w:tcW w:type="dxa" w:w="1800"/>
+            <w:tcMar>
+              <w:top w:w="80" w:type="dxa"/>
+              <w:start w:w="120" w:type="dxa"/>
+              <w:bottom w:w="80" w:type="dxa"/>
+              <w:end w:w="120" w:type="dxa"/>
+            </w:tcMar>
+            <w:vAlign w:val="top"/>
+            <w:shd w:fill="F2EFE9"/>
+          </w:tcPr>
+          <w:p>
+            <w:pPr>
+              <w:spacing w:before="0" w:after="0" w:line="276" w:lineRule="auto"/>
+              <w:jc w:val="left"/>
+            </w:pPr>
+            <w:r/>
+            <w:r>
+              <w:rPr>
+                <w:rFonts w:ascii="Calibri" w:hAnsi="Calibri"/>
+                <w:b/>
+                <w:i w:val="0"/>
+                <w:color w:val="2F8B57"/>
+                <w:sz w:val="19"/>
+              </w:rPr>
+              <w:t>Problem</w:t>
+            </w:r>
+          </w:p>
+        </w:tc>
+        <w:tc>
+          <w:tcPr>
+            <w:tcW w:type="dxa" w:w="7560"/>
+            <w:tcMar>
+              <w:top w:w="80" w:type="dxa"/>
+              <w:start w:w="120" w:type="dxa"/>
+              <w:bottom w:w="80" w:type="dxa"/>
+              <w:end w:w="120" w:type="dxa"/>
+            </w:tcMar>
+            <w:vAlign w:val="top"/>
+            <w:shd w:fill="FBFAF7"/>
+          </w:tcPr>
+          <w:p>
+            <w:pPr>
+              <w:spacing w:before="0" w:after="0" w:line="276" w:lineRule="auto"/>
+              <w:jc w:val="left"/>
+            </w:pPr>
+            <w:r/>
+            <w:r>
+              <w:rPr>
+                <w:rFonts w:ascii="Calibri" w:hAnsi="Calibri"/>
+                <w:b w:val="0"/>
+                <w:i/>
+                <w:color w:val="5F5A53"/>
+                <w:sz w:val="20"/>
+              </w:rPr>
+              <w:t>[what is happening today?]</w:t>
+            </w:r>
+          </w:p>
+        </w:tc>
+      </w:tr>
+      <w:tr>
+        <w:tc>
+          <w:tcPr>
+            <w:tcW w:type="dxa" w:w="1800"/>
+            <w:tcMar>
+              <w:top w:w="80" w:type="dxa"/>
+              <w:start w:w="120" w:type="dxa"/>
+              <w:bottom w:w="80" w:type="dxa"/>
+              <w:end w:w="120" w:type="dxa"/>
+            </w:tcMar>
+            <w:vAlign w:val="top"/>
+            <w:shd w:fill="F2EFE9"/>
+          </w:tcPr>
+          <w:p>
+            <w:pPr>
+              <w:spacing w:before="0" w:after="0" w:line="276" w:lineRule="auto"/>
+              <w:jc w:val="left"/>
+            </w:pPr>
+            <w:r/>
+            <w:r>
+              <w:rPr>
+                <w:rFonts w:ascii="Calibri" w:hAnsi="Calibri"/>
+                <w:b/>
+                <w:i w:val="0"/>
+                <w:color w:val="2F8B57"/>
+                <w:sz w:val="19"/>
+              </w:rPr>
+              <w:t>Scope</w:t>
+            </w:r>
+          </w:p>
+        </w:tc>
+        <w:tc>
+          <w:tcPr>
+            <w:tcW w:type="dxa" w:w="7560"/>
+            <w:tcMar>
+              <w:top w:w="80" w:type="dxa"/>
+              <w:start w:w="120" w:type="dxa"/>
+              <w:bottom w:w="80" w:type="dxa"/>
+              <w:end w:w="120" w:type="dxa"/>
+            </w:tcMar>
+            <w:vAlign w:val="top"/>
+            <w:shd w:fill="FBFAF7"/>
+          </w:tcPr>
+          <w:p>
+            <w:pPr>
+              <w:spacing w:before="0" w:after="0" w:line="276" w:lineRule="auto"/>
+              <w:jc w:val="left"/>
+            </w:pPr>
+            <w:r/>
+            <w:r>
+              <w:rPr>
+                <w:rFonts w:ascii="Calibri" w:hAnsi="Calibri"/>
+                <w:b w:val="0"/>
+                <w:i/>
+                <w:color w:val="5F5A53"/>
+                <w:sz w:val="20"/>
+              </w:rPr>
+              <w:t>[what is included or excluded?]</w:t>
+            </w:r>
+          </w:p>
+        </w:tc>
+      </w:tr>
+      <w:tr>
+        <w:tc>
+          <w:tcPr>
+            <w:tcW w:type="dxa" w:w="1800"/>
+            <w:tcMar>
+              <w:top w:w="80" w:type="dxa"/>
+              <w:start w:w="120" w:type="dxa"/>
+              <w:bottom w:w="80" w:type="dxa"/>
+              <w:end w:w="120" w:type="dxa"/>
+            </w:tcMar>
+            <w:vAlign w:val="top"/>
+            <w:shd w:fill="F2EFE9"/>
+          </w:tcPr>
+          <w:p>
+            <w:pPr>
+              <w:spacing w:before="0" w:after="0" w:line="276" w:lineRule="auto"/>
+              <w:jc w:val="left"/>
+            </w:pPr>
+            <w:r/>
+            <w:r>
+              <w:rPr>
+                <w:rFonts w:ascii="Calibri" w:hAnsi="Calibri"/>
+                <w:b/>
+                <w:i w:val="0"/>
+                <w:color w:val="2F8B57"/>
+                <w:sz w:val="19"/>
+              </w:rPr>
+              <w:t>Dependencies</w:t>
+            </w:r>
+          </w:p>
+        </w:tc>
+        <w:tc>
+          <w:tcPr>
+            <w:tcW w:type="dxa" w:w="7560"/>
+            <w:tcMar>
+              <w:top w:w="80" w:type="dxa"/>
+              <w:start w:w="120" w:type="dxa"/>
+              <w:bottom w:w="80" w:type="dxa"/>
+              <w:end w:w="120" w:type="dxa"/>
+            </w:tcMar>
+            <w:vAlign w:val="top"/>
+            <w:shd w:fill="FBFAF7"/>
+          </w:tcPr>
+          <w:p>
+            <w:pPr>
+              <w:spacing w:before="0" w:after="0" w:line="276" w:lineRule="auto"/>
+              <w:jc w:val="left"/>
+            </w:pPr>
+            <w:r/>
+            <w:r>
+              <w:rPr>
+                <w:rFonts w:ascii="Calibri" w:hAnsi="Calibri"/>
+                <w:b w:val="0"/>
+                <w:i/>
+                <w:color w:val="5F5A53"/>
+                <w:sz w:val="20"/>
+              </w:rPr>
+              <w:t>[systems, approvals, data, people]</w:t>
+            </w:r>
+          </w:p>
+        </w:tc>
+      </w:tr>
+    </w:tbl>
+    <w:p>
+      <w:pPr>
+        <w:spacing w:before="0" w:after="80" w:line="240" w:lineRule="auto"/>
+        <w:jc w:val="left"/>
+      </w:pPr>
+      <w:r>
+        <w:rPr>
+          <w:rFonts w:ascii="Calibri" w:hAnsi="Calibri"/>
+          <w:b/>
+          <w:i w:val="0"/>
+          <w:color w:val="2F8B57"/>
+          <w:sz w:val="19"/>
+        </w:rPr>
+        <w:t>Acceptance criteria</w:t>
+      </w:r>
+    </w:p>
+    <w:p>
+      <w:pPr>
+        <w:spacing w:before="0" w:after="200" w:line="288" w:lineRule="auto"/>
+        <w:jc w:val="left"/>
+      </w:pPr>
+      <w:r>
+        <w:rPr>
+          <w:rFonts w:ascii="Calibri" w:hAnsi="Calibri"/>
+          <w:b w:val="0"/>
+          <w:i w:val="0"/>
+          <w:color w:val="5F5A53"/>
+          <w:sz w:val="21"/>
+        </w:rPr>
+        <w:t>Write each line as something the team can test.</w:t>
+      </w:r>
+    </w:p>
+    <w:tbl>
+      <w:tblPr>
+        <w:tblW w:type="dxa" w:w="9360"/>
+        <w:jc w:val="center"/>
+        <w:tblLayout w:type="fixed"/>
+        <w:tblLook w:firstColumn="1" w:firstRow="1" w:lastColumn="0" w:lastRow="0" w:noHBand="0" w:noVBand="1" w:val="04A0"/>
+        <w:tblInd w:w="120" w:type="dxa"/>
+        <w:tblBorders>
+          <w:top w:val="single" w:sz="8" w:space="0" w:color="D9D5CE"/>
+          <w:left w:val="single" w:sz="8" w:space="0" w:color="D9D5CE"/>
+          <w:bottom w:val="single" w:sz="8" w:space="0" w:color="D9D5CE"/>
+          <w:right w:val="single" w:sz="8" w:space="0" w:color="D9D5CE"/>
+          <w:insideH w:val="single" w:sz="8" w:space="0" w:color="D9D5CE"/>
+          <w:insideV w:val="single" w:sz="8" w:space="0" w:color="D9D5CE"/>
+        </w:tblBorders>
+      </w:tblPr>
+      <w:tblGrid>
+        <w:gridCol w:w="648"/>
+        <w:gridCol w:w="6696"/>
+        <w:gridCol w:w="2015"/>
+      </w:tblGrid>
+      <w:tr>
+        <w:tc>
+          <w:tcPr>
+            <w:tcW w:type="dxa" w:w="648"/>
+            <w:tcMar>
+              <w:top w:w="80" w:type="dxa"/>
+              <w:start w:w="120" w:type="dxa"/>
+              <w:bottom w:w="80" w:type="dxa"/>
+              <w:end w:w="120" w:type="dxa"/>
+            </w:tcMar>
+            <w:vAlign w:val="top"/>
+            <w:shd w:fill="F2EFE9"/>
+          </w:tcPr>
+          <w:p>
+            <w:pPr>
+              <w:spacing w:before="0" w:after="0" w:line="276" w:lineRule="auto"/>
+              <w:jc w:val="center"/>
+            </w:pPr>
+            <w:r/>
+            <w:r>
+              <w:rPr>
+                <w:rFonts w:ascii="Calibri" w:hAnsi="Calibri"/>
+                <w:b/>
+                <w:i w:val="0"/>
+                <w:color w:val="111111"/>
+                <w:sz w:val="18"/>
+              </w:rPr>
+              <w:t>#</w:t>
             </w:r>
           </w:p>
         </w:tc>
@@ -376,29 +1005,59 @@
           <w:tcPr>
             <w:tcW w:type="dxa" w:w="6696"/>
             <w:tcMar>
-              <w:top w:w="100" w:type="dxa"/>
+              <w:top w:w="80" w:type="dxa"/>
               <w:start w:w="120" w:type="dxa"/>
-              <w:bottom w:w="100" w:type="dxa"/>
+              <w:bottom w:w="80" w:type="dxa"/>
               <w:end w:w="120" w:type="dxa"/>
             </w:tcMar>
-            <w:shd w:fill="E8EEF5"/>
-            <w:vAlign w:val="center"/>
+            <w:vAlign w:val="top"/>
+            <w:shd w:fill="F2EFE9"/>
           </w:tcPr>
           <w:p>
             <w:pPr>
-              <w:spacing w:after="0" w:before="0" w:line="276" w:lineRule="auto"/>
-              <w:jc w:val="left"/>
+              <w:spacing w:before="0" w:after="0" w:line="276" w:lineRule="auto"/>
+              <w:jc w:val="center"/>
             </w:pPr>
             <w:r/>
             <w:r>
               <w:rPr>
-                <w:rFonts w:ascii="Calibri" w:hAnsi="Calibri" w:eastAsia="Calibri"/>
-                <w:b w:val="0"/>
-                <w:i/>
-                <w:color w:val="7A7A7A"/>
-                <w:sz w:val="22"/>
+                <w:rFonts w:ascii="Calibri" w:hAnsi="Calibri"/>
+                <w:b/>
+                <w:i w:val="0"/>
+                <w:color w:val="111111"/>
+                <w:sz w:val="18"/>
               </w:rPr>
-              <w:t>Write a short, specific title</w:t>
+              <w:t>Criterion</w:t>
+            </w:r>
+          </w:p>
+        </w:tc>
+        <w:tc>
+          <w:tcPr>
+            <w:tcW w:type="dxa" w:w="2015"/>
+            <w:tcMar>
+              <w:top w:w="80" w:type="dxa"/>
+              <w:start w:w="120" w:type="dxa"/>
+              <w:bottom w:w="80" w:type="dxa"/>
+              <w:end w:w="120" w:type="dxa"/>
+            </w:tcMar>
+            <w:vAlign w:val="top"/>
+            <w:shd w:fill="F2EFE9"/>
+          </w:tcPr>
+          <w:p>
+            <w:pPr>
+              <w:spacing w:before="0" w:after="0" w:line="276" w:lineRule="auto"/>
+              <w:jc w:val="center"/>
+            </w:pPr>
+            <w:r/>
+            <w:r>
+              <w:rPr>
+                <w:rFonts w:ascii="Calibri" w:hAnsi="Calibri"/>
+                <w:b/>
+                <w:i w:val="0"/>
+                <w:color w:val="111111"/>
+                <w:sz w:val="18"/>
+              </w:rPr>
+              <w:t>Validation / proof</w:t>
             </w:r>
           </w:p>
         </w:tc>
@@ -406,31 +1065,31 @@
       <w:tr>
         <w:tc>
           <w:tcPr>
-            <w:tcW w:type="dxa" w:w="2664"/>
+            <w:tcW w:type="dxa" w:w="648"/>
             <w:tcMar>
-              <w:top w:w="100" w:type="dxa"/>
+              <w:top w:w="80" w:type="dxa"/>
               <w:start w:w="120" w:type="dxa"/>
-              <w:bottom w:w="100" w:type="dxa"/>
+              <w:bottom w:w="80" w:type="dxa"/>
               <w:end w:w="120" w:type="dxa"/>
             </w:tcMar>
-            <w:shd w:fill="F2F4F7"/>
-            <w:vAlign w:val="center"/>
+            <w:vAlign w:val="top"/>
+            <w:shd w:fill="F2EFE9"/>
           </w:tcPr>
           <w:p>
             <w:pPr>
-              <w:spacing w:after="0" w:before="0" w:line="276" w:lineRule="auto"/>
-              <w:jc w:val="left"/>
+              <w:spacing w:before="0" w:after="0" w:line="276" w:lineRule="auto"/>
+              <w:jc w:val="center"/>
             </w:pPr>
             <w:r/>
             <w:r>
               <w:rPr>
-                <w:rFonts w:ascii="Calibri" w:hAnsi="Calibri" w:eastAsia="Calibri"/>
+                <w:rFonts w:ascii="Calibri" w:hAnsi="Calibri"/>
                 <w:b/>
                 <w:i w:val="0"/>
-                <w:color w:val="1F4D78"/>
-                <w:sz w:val="22"/>
+                <w:color w:val="2F8B57"/>
+                <w:sz w:val="20"/>
               </w:rPr>
-              <w:t>User / persona</w:t>
+              <w:t>1</w:t>
             </w:r>
           </w:p>
         </w:tc>
@@ -438,29 +1097,59 @@
           <w:tcPr>
             <w:tcW w:type="dxa" w:w="6696"/>
             <w:tcMar>
-              <w:top w:w="100" w:type="dxa"/>
+              <w:top w:w="80" w:type="dxa"/>
               <w:start w:w="120" w:type="dxa"/>
-              <w:bottom w:w="100" w:type="dxa"/>
+              <w:bottom w:w="80" w:type="dxa"/>
               <w:end w:w="120" w:type="dxa"/>
             </w:tcMar>
-            <w:shd w:fill="F7FBFD"/>
-            <w:vAlign w:val="center"/>
+            <w:vAlign w:val="top"/>
+            <w:shd w:fill="FBFAF7"/>
           </w:tcPr>
           <w:p>
             <w:pPr>
-              <w:spacing w:after="0" w:before="0" w:line="276" w:lineRule="auto"/>
+              <w:spacing w:before="0" w:after="0" w:line="276" w:lineRule="auto"/>
               <w:jc w:val="left"/>
             </w:pPr>
             <w:r/>
             <w:r>
               <w:rPr>
-                <w:rFonts w:ascii="Calibri" w:hAnsi="Calibri" w:eastAsia="Calibri"/>
+                <w:rFonts w:ascii="Calibri" w:hAnsi="Calibri"/>
                 <w:b w:val="0"/>
                 <w:i/>
-                <w:color w:val="7A7A7A"/>
-                <w:sz w:val="22"/>
+                <w:color w:val="5F5A53"/>
+                <w:sz w:val="20"/>
               </w:rPr>
-              <w:t>Who needs this?</w:t>
+              <w:t>[criterion 1]</w:t>
+            </w:r>
+          </w:p>
+        </w:tc>
+        <w:tc>
+          <w:tcPr>
+            <w:tcW w:type="dxa" w:w="2015"/>
+            <w:tcMar>
+              <w:top w:w="80" w:type="dxa"/>
+              <w:start w:w="120" w:type="dxa"/>
+              <w:bottom w:w="80" w:type="dxa"/>
+              <w:end w:w="120" w:type="dxa"/>
+            </w:tcMar>
+            <w:vAlign w:val="top"/>
+            <w:shd w:fill="FBFAF7"/>
+          </w:tcPr>
+          <w:p>
+            <w:pPr>
+              <w:spacing w:before="0" w:after="0" w:line="276" w:lineRule="auto"/>
+              <w:jc w:val="left"/>
+            </w:pPr>
+            <w:r/>
+            <w:r>
+              <w:rPr>
+                <w:rFonts w:ascii="Calibri" w:hAnsi="Calibri"/>
+                <w:b w:val="0"/>
+                <w:i/>
+                <w:color w:val="5F5A53"/>
+                <w:sz w:val="20"/>
+              </w:rPr>
+              <w:t>[how will you validate it?]</w:t>
             </w:r>
           </w:p>
         </w:tc>
@@ -468,31 +1157,31 @@
       <w:tr>
         <w:tc>
           <w:tcPr>
-            <w:tcW w:type="dxa" w:w="2664"/>
+            <w:tcW w:type="dxa" w:w="648"/>
             <w:tcMar>
-              <w:top w:w="100" w:type="dxa"/>
+              <w:top w:w="80" w:type="dxa"/>
               <w:start w:w="120" w:type="dxa"/>
-              <w:bottom w:w="100" w:type="dxa"/>
+              <w:bottom w:w="80" w:type="dxa"/>
               <w:end w:w="120" w:type="dxa"/>
             </w:tcMar>
-            <w:shd w:fill="F2F4F7"/>
-            <w:vAlign w:val="center"/>
+            <w:vAlign w:val="top"/>
+            <w:shd w:fill="F2EFE9"/>
           </w:tcPr>
           <w:p>
             <w:pPr>
-              <w:spacing w:after="0" w:before="0" w:line="276" w:lineRule="auto"/>
-              <w:jc w:val="left"/>
+              <w:spacing w:before="0" w:after="0" w:line="276" w:lineRule="auto"/>
+              <w:jc w:val="center"/>
             </w:pPr>
             <w:r/>
             <w:r>
               <w:rPr>
-                <w:rFonts w:ascii="Calibri" w:hAnsi="Calibri" w:eastAsia="Calibri"/>
+                <w:rFonts w:ascii="Calibri" w:hAnsi="Calibri"/>
                 <w:b/>
                 <w:i w:val="0"/>
-                <w:color w:val="1F4D78"/>
-                <w:sz w:val="22"/>
+                <w:color w:val="2F8B57"/>
+                <w:sz w:val="20"/>
               </w:rPr>
-              <w:t>Goal</w:t>
+              <w:t>2</w:t>
             </w:r>
           </w:p>
         </w:tc>
@@ -500,29 +1189,59 @@
           <w:tcPr>
             <w:tcW w:type="dxa" w:w="6696"/>
             <w:tcMar>
-              <w:top w:w="100" w:type="dxa"/>
+              <w:top w:w="80" w:type="dxa"/>
               <w:start w:w="120" w:type="dxa"/>
-              <w:bottom w:w="100" w:type="dxa"/>
+              <w:bottom w:w="80" w:type="dxa"/>
               <w:end w:w="120" w:type="dxa"/>
             </w:tcMar>
-            <w:shd w:fill="E8EEF5"/>
-            <w:vAlign w:val="center"/>
+            <w:vAlign w:val="top"/>
+            <w:shd w:fill="FBFAF7"/>
           </w:tcPr>
           <w:p>
             <w:pPr>
-              <w:spacing w:after="0" w:before="0" w:line="276" w:lineRule="auto"/>
+              <w:spacing w:before="0" w:after="0" w:line="276" w:lineRule="auto"/>
               <w:jc w:val="left"/>
             </w:pPr>
             <w:r/>
             <w:r>
               <w:rPr>
-                <w:rFonts w:ascii="Calibri" w:hAnsi="Calibri" w:eastAsia="Calibri"/>
+                <w:rFonts w:ascii="Calibri" w:hAnsi="Calibri"/>
                 <w:b w:val="0"/>
                 <w:i/>
-                <w:color w:val="7A7A7A"/>
-                <w:sz w:val="22"/>
+                <w:color w:val="5F5A53"/>
+                <w:sz w:val="20"/>
               </w:rPr>
-              <w:t>What are they trying to achieve?</w:t>
+              <w:t>[criterion 2]</w:t>
+            </w:r>
+          </w:p>
+        </w:tc>
+        <w:tc>
+          <w:tcPr>
+            <w:tcW w:type="dxa" w:w="2015"/>
+            <w:tcMar>
+              <w:top w:w="80" w:type="dxa"/>
+              <w:start w:w="120" w:type="dxa"/>
+              <w:bottom w:w="80" w:type="dxa"/>
+              <w:end w:w="120" w:type="dxa"/>
+            </w:tcMar>
+            <w:vAlign w:val="top"/>
+            <w:shd w:fill="FBFAF7"/>
+          </w:tcPr>
+          <w:p>
+            <w:pPr>
+              <w:spacing w:before="0" w:after="0" w:line="276" w:lineRule="auto"/>
+              <w:jc w:val="left"/>
+            </w:pPr>
+            <w:r/>
+            <w:r>
+              <w:rPr>
+                <w:rFonts w:ascii="Calibri" w:hAnsi="Calibri"/>
+                <w:b w:val="0"/>
+                <w:i/>
+                <w:color w:val="5F5A53"/>
+                <w:sz w:val="20"/>
+              </w:rPr>
+              <w:t>[how will you validate it?]</w:t>
             </w:r>
           </w:p>
         </w:tc>
@@ -530,31 +1249,31 @@
       <w:tr>
         <w:tc>
           <w:tcPr>
-            <w:tcW w:type="dxa" w:w="2664"/>
+            <w:tcW w:type="dxa" w:w="648"/>
             <w:tcMar>
-              <w:top w:w="100" w:type="dxa"/>
+              <w:top w:w="80" w:type="dxa"/>
               <w:start w:w="120" w:type="dxa"/>
-              <w:bottom w:w="100" w:type="dxa"/>
+              <w:bottom w:w="80" w:type="dxa"/>
               <w:end w:w="120" w:type="dxa"/>
             </w:tcMar>
-            <w:shd w:fill="F2F4F7"/>
-            <w:vAlign w:val="center"/>
+            <w:vAlign w:val="top"/>
+            <w:shd w:fill="F2EFE9"/>
           </w:tcPr>
           <w:p>
             <w:pPr>
-              <w:spacing w:after="0" w:before="0" w:line="276" w:lineRule="auto"/>
-              <w:jc w:val="left"/>
+              <w:spacing w:before="0" w:after="0" w:line="276" w:lineRule="auto"/>
+              <w:jc w:val="center"/>
             </w:pPr>
             <w:r/>
             <w:r>
               <w:rPr>
-                <w:rFonts w:ascii="Calibri" w:hAnsi="Calibri" w:eastAsia="Calibri"/>
+                <w:rFonts w:ascii="Calibri" w:hAnsi="Calibri"/>
                 <w:b/>
                 <w:i w:val="0"/>
-                <w:color w:val="1F4D78"/>
-                <w:sz w:val="22"/>
+                <w:color w:val="2F8B57"/>
+                <w:sz w:val="20"/>
               </w:rPr>
-              <w:t>Business value</w:t>
+              <w:t>3</w:t>
             </w:r>
           </w:p>
         </w:tc>
@@ -562,29 +1281,59 @@
           <w:tcPr>
             <w:tcW w:type="dxa" w:w="6696"/>
             <w:tcMar>
-              <w:top w:w="100" w:type="dxa"/>
+              <w:top w:w="80" w:type="dxa"/>
               <w:start w:w="120" w:type="dxa"/>
-              <w:bottom w:w="100" w:type="dxa"/>
+              <w:bottom w:w="80" w:type="dxa"/>
               <w:end w:w="120" w:type="dxa"/>
             </w:tcMar>
-            <w:shd w:fill="F7FBFD"/>
-            <w:vAlign w:val="center"/>
+            <w:vAlign w:val="top"/>
+            <w:shd w:fill="FBFAF7"/>
           </w:tcPr>
           <w:p>
             <w:pPr>
-              <w:spacing w:after="0" w:before="0" w:line="276" w:lineRule="auto"/>
+              <w:spacing w:before="0" w:after="0" w:line="276" w:lineRule="auto"/>
               <w:jc w:val="left"/>
             </w:pPr>
             <w:r/>
             <w:r>
               <w:rPr>
-                <w:rFonts w:ascii="Calibri" w:hAnsi="Calibri" w:eastAsia="Calibri"/>
+                <w:rFonts w:ascii="Calibri" w:hAnsi="Calibri"/>
                 <w:b w:val="0"/>
                 <w:i/>
-                <w:color w:val="7A7A7A"/>
-                <w:sz w:val="22"/>
+                <w:color w:val="5F5A53"/>
+                <w:sz w:val="20"/>
               </w:rPr>
-              <w:t>Why does this matter?</w:t>
+              <w:t>[criterion 3]</w:t>
+            </w:r>
+          </w:p>
+        </w:tc>
+        <w:tc>
+          <w:tcPr>
+            <w:tcW w:type="dxa" w:w="2015"/>
+            <w:tcMar>
+              <w:top w:w="80" w:type="dxa"/>
+              <w:start w:w="120" w:type="dxa"/>
+              <w:bottom w:w="80" w:type="dxa"/>
+              <w:end w:w="120" w:type="dxa"/>
+            </w:tcMar>
+            <w:vAlign w:val="top"/>
+            <w:shd w:fill="FBFAF7"/>
+          </w:tcPr>
+          <w:p>
+            <w:pPr>
+              <w:spacing w:before="0" w:after="0" w:line="276" w:lineRule="auto"/>
+              <w:jc w:val="left"/>
+            </w:pPr>
+            <w:r/>
+            <w:r>
+              <w:rPr>
+                <w:rFonts w:ascii="Calibri" w:hAnsi="Calibri"/>
+                <w:b w:val="0"/>
+                <w:i/>
+                <w:color w:val="5F5A53"/>
+                <w:sz w:val="20"/>
+              </w:rPr>
+              <w:t>[how will you validate it?]</w:t>
             </w:r>
           </w:p>
         </w:tc>
@@ -592,31 +1341,31 @@
       <w:tr>
         <w:tc>
           <w:tcPr>
-            <w:tcW w:type="dxa" w:w="2664"/>
+            <w:tcW w:type="dxa" w:w="648"/>
             <w:tcMar>
-              <w:top w:w="100" w:type="dxa"/>
+              <w:top w:w="80" w:type="dxa"/>
               <w:start w:w="120" w:type="dxa"/>
-              <w:bottom w:w="100" w:type="dxa"/>
+              <w:bottom w:w="80" w:type="dxa"/>
               <w:end w:w="120" w:type="dxa"/>
             </w:tcMar>
-            <w:shd w:fill="F2F4F7"/>
-            <w:vAlign w:val="center"/>
+            <w:vAlign w:val="top"/>
+            <w:shd w:fill="F2EFE9"/>
           </w:tcPr>
           <w:p>
             <w:pPr>
-              <w:spacing w:after="0" w:before="0" w:line="276" w:lineRule="auto"/>
-              <w:jc w:val="left"/>
+              <w:spacing w:before="0" w:after="0" w:line="276" w:lineRule="auto"/>
+              <w:jc w:val="center"/>
             </w:pPr>
             <w:r/>
             <w:r>
               <w:rPr>
-                <w:rFonts w:ascii="Calibri" w:hAnsi="Calibri" w:eastAsia="Calibri"/>
+                <w:rFonts w:ascii="Calibri" w:hAnsi="Calibri"/>
                 <w:b/>
                 <w:i w:val="0"/>
-                <w:color w:val="1F4D78"/>
-                <w:sz w:val="22"/>
+                <w:color w:val="2F8B57"/>
+                <w:sz w:val="20"/>
               </w:rPr>
-              <w:t>Priority</w:t>
+              <w:t>4</w:t>
             </w:r>
           </w:p>
         </w:tc>
@@ -624,29 +1373,59 @@
           <w:tcPr>
             <w:tcW w:type="dxa" w:w="6696"/>
             <w:tcMar>
-              <w:top w:w="100" w:type="dxa"/>
+              <w:top w:w="80" w:type="dxa"/>
               <w:start w:w="120" w:type="dxa"/>
-              <w:bottom w:w="100" w:type="dxa"/>
+              <w:bottom w:w="80" w:type="dxa"/>
               <w:end w:w="120" w:type="dxa"/>
             </w:tcMar>
-            <w:shd w:fill="E8EEF5"/>
-            <w:vAlign w:val="center"/>
+            <w:vAlign w:val="top"/>
+            <w:shd w:fill="FBFAF7"/>
           </w:tcPr>
           <w:p>
             <w:pPr>
-              <w:spacing w:after="0" w:before="0" w:line="276" w:lineRule="auto"/>
+              <w:spacing w:before="0" w:after="0" w:line="276" w:lineRule="auto"/>
               <w:jc w:val="left"/>
             </w:pPr>
             <w:r/>
             <w:r>
               <w:rPr>
-                <w:rFonts w:ascii="Calibri" w:hAnsi="Calibri" w:eastAsia="Calibri"/>
+                <w:rFonts w:ascii="Calibri" w:hAnsi="Calibri"/>
                 <w:b w:val="0"/>
                 <w:i/>
-                <w:color w:val="7A7A7A"/>
-                <w:sz w:val="22"/>
+                <w:color w:val="5F5A53"/>
+                <w:sz w:val="20"/>
               </w:rPr>
-              <w:t>High / Medium / Low</w:t>
+              <w:t>[criterion 4]</w:t>
+            </w:r>
+          </w:p>
+        </w:tc>
+        <w:tc>
+          <w:tcPr>
+            <w:tcW w:type="dxa" w:w="2015"/>
+            <w:tcMar>
+              <w:top w:w="80" w:type="dxa"/>
+              <w:start w:w="120" w:type="dxa"/>
+              <w:bottom w:w="80" w:type="dxa"/>
+              <w:end w:w="120" w:type="dxa"/>
+            </w:tcMar>
+            <w:vAlign w:val="top"/>
+            <w:shd w:fill="FBFAF7"/>
+          </w:tcPr>
+          <w:p>
+            <w:pPr>
+              <w:spacing w:before="0" w:after="0" w:line="276" w:lineRule="auto"/>
+              <w:jc w:val="left"/>
+            </w:pPr>
+            <w:r/>
+            <w:r>
+              <w:rPr>
+                <w:rFonts w:ascii="Calibri" w:hAnsi="Calibri"/>
+                <w:b w:val="0"/>
+                <w:i/>
+                <w:color w:val="5F5A53"/>
+                <w:sz w:val="20"/>
+              </w:rPr>
+              <w:t>[how will you validate it?]</w:t>
             </w:r>
           </w:p>
         </w:tc>
@@ -654,31 +1433,31 @@
       <w:tr>
         <w:tc>
           <w:tcPr>
-            <w:tcW w:type="dxa" w:w="2664"/>
+            <w:tcW w:type="dxa" w:w="648"/>
             <w:tcMar>
-              <w:top w:w="100" w:type="dxa"/>
+              <w:top w:w="80" w:type="dxa"/>
               <w:start w:w="120" w:type="dxa"/>
-              <w:bottom w:w="100" w:type="dxa"/>
+              <w:bottom w:w="80" w:type="dxa"/>
               <w:end w:w="120" w:type="dxa"/>
             </w:tcMar>
-            <w:shd w:fill="F2F4F7"/>
-            <w:vAlign w:val="center"/>
+            <w:vAlign w:val="top"/>
+            <w:shd w:fill="F2EFE9"/>
           </w:tcPr>
           <w:p>
             <w:pPr>
-              <w:spacing w:after="0" w:before="0" w:line="276" w:lineRule="auto"/>
-              <w:jc w:val="left"/>
+              <w:spacing w:before="0" w:after="0" w:line="276" w:lineRule="auto"/>
+              <w:jc w:val="center"/>
             </w:pPr>
             <w:r/>
             <w:r>
               <w:rPr>
-                <w:rFonts w:ascii="Calibri" w:hAnsi="Calibri" w:eastAsia="Calibri"/>
+                <w:rFonts w:ascii="Calibri" w:hAnsi="Calibri"/>
                 <w:b/>
                 <w:i w:val="0"/>
-                <w:color w:val="1F4D78"/>
-                <w:sz w:val="22"/>
+                <w:color w:val="2F8B57"/>
+                <w:sz w:val="20"/>
               </w:rPr>
-              <w:t>Context</w:t>
+              <w:t>5</w:t>
             </w:r>
           </w:p>
         </w:tc>
@@ -686,29 +1465,174 @@
           <w:tcPr>
             <w:tcW w:type="dxa" w:w="6696"/>
             <w:tcMar>
-              <w:top w:w="100" w:type="dxa"/>
+              <w:top w:w="80" w:type="dxa"/>
               <w:start w:w="120" w:type="dxa"/>
-              <w:bottom w:w="100" w:type="dxa"/>
+              <w:bottom w:w="80" w:type="dxa"/>
               <w:end w:w="120" w:type="dxa"/>
             </w:tcMar>
-            <w:shd w:fill="F7FBFD"/>
-            <w:vAlign w:val="center"/>
+            <w:vAlign w:val="top"/>
+            <w:shd w:fill="FBFAF7"/>
           </w:tcPr>
           <w:p>
             <w:pPr>
-              <w:spacing w:after="0" w:before="0" w:line="276" w:lineRule="auto"/>
+              <w:spacing w:before="0" w:after="0" w:line="276" w:lineRule="auto"/>
               <w:jc w:val="left"/>
             </w:pPr>
             <w:r/>
             <w:r>
               <w:rPr>
-                <w:rFonts w:ascii="Calibri" w:hAnsi="Calibri" w:eastAsia="Calibri"/>
+                <w:rFonts w:ascii="Calibri" w:hAnsi="Calibri"/>
                 <w:b w:val="0"/>
                 <w:i/>
-                <w:color w:val="7A7A7A"/>
-                <w:sz w:val="22"/>
+                <w:color w:val="5F5A53"/>
+                <w:sz w:val="20"/>
               </w:rPr>
-              <w:t>Background, scope, assumptions</w:t>
+              <w:t>[criterion 5]</w:t>
+            </w:r>
+          </w:p>
+        </w:tc>
+        <w:tc>
+          <w:tcPr>
+            <w:tcW w:type="dxa" w:w="2015"/>
+            <w:tcMar>
+              <w:top w:w="80" w:type="dxa"/>
+              <w:start w:w="120" w:type="dxa"/>
+              <w:bottom w:w="80" w:type="dxa"/>
+              <w:end w:w="120" w:type="dxa"/>
+            </w:tcMar>
+            <w:vAlign w:val="top"/>
+            <w:shd w:fill="FBFAF7"/>
+          </w:tcPr>
+          <w:p>
+            <w:pPr>
+              <w:spacing w:before="0" w:after="0" w:line="276" w:lineRule="auto"/>
+              <w:jc w:val="left"/>
+            </w:pPr>
+            <w:r/>
+            <w:r>
+              <w:rPr>
+                <w:rFonts w:ascii="Calibri" w:hAnsi="Calibri"/>
+                <w:b w:val="0"/>
+                <w:i/>
+                <w:color w:val="5F5A53"/>
+                <w:sz w:val="20"/>
+              </w:rPr>
+              <w:t>[how will you validate it?]</w:t>
+            </w:r>
+          </w:p>
+        </w:tc>
+      </w:tr>
+    </w:tbl>
+    <w:p>
+      <w:pPr>
+        <w:spacing w:before="0" w:after="80" w:line="240" w:lineRule="auto"/>
+        <w:jc w:val="left"/>
+      </w:pPr>
+      <w:r>
+        <w:rPr>
+          <w:rFonts w:ascii="Calibri" w:hAnsi="Calibri"/>
+          <w:b/>
+          <w:i w:val="0"/>
+          <w:color w:val="2F8B57"/>
+          <w:sz w:val="19"/>
+        </w:rPr>
+        <w:t>Notes and risks</w:t>
+      </w:r>
+    </w:p>
+    <w:p>
+      <w:pPr>
+        <w:spacing w:before="0" w:after="200" w:line="288" w:lineRule="auto"/>
+        <w:jc w:val="left"/>
+      </w:pPr>
+      <w:r>
+        <w:rPr>
+          <w:rFonts w:ascii="Calibri" w:hAnsi="Calibri"/>
+          <w:b w:val="0"/>
+          <w:i w:val="0"/>
+          <w:color w:val="5F5A53"/>
+          <w:sz w:val="21"/>
+        </w:rPr>
+        <w:t>Keep anything extra here so the main story stays clean.</w:t>
+      </w:r>
+    </w:p>
+    <w:tbl>
+      <w:tblPr>
+        <w:tblW w:type="dxa" w:w="9360"/>
+        <w:jc w:val="center"/>
+        <w:tblLayout w:type="fixed"/>
+        <w:tblLook w:firstColumn="1" w:firstRow="1" w:lastColumn="0" w:lastRow="0" w:noHBand="0" w:noVBand="1" w:val="04A0"/>
+        <w:tblInd w:w="120" w:type="dxa"/>
+        <w:tblBorders>
+          <w:top w:val="single" w:sz="8" w:space="0" w:color="D9D5CE"/>
+          <w:left w:val="single" w:sz="8" w:space="0" w:color="D9D5CE"/>
+          <w:bottom w:val="single" w:sz="8" w:space="0" w:color="D9D5CE"/>
+          <w:right w:val="single" w:sz="8" w:space="0" w:color="D9D5CE"/>
+          <w:insideH w:val="single" w:sz="8" w:space="0" w:color="D9D5CE"/>
+          <w:insideV w:val="single" w:sz="8" w:space="0" w:color="D9D5CE"/>
+        </w:tblBorders>
+      </w:tblPr>
+      <w:tblGrid>
+        <w:gridCol w:w="1800"/>
+        <w:gridCol w:w="7560"/>
+      </w:tblGrid>
+      <w:tr>
+        <w:tc>
+          <w:tcPr>
+            <w:tcW w:type="dxa" w:w="1800"/>
+            <w:tcMar>
+              <w:top w:w="80" w:type="dxa"/>
+              <w:start w:w="120" w:type="dxa"/>
+              <w:bottom w:w="80" w:type="dxa"/>
+              <w:end w:w="120" w:type="dxa"/>
+            </w:tcMar>
+            <w:vAlign w:val="top"/>
+            <w:shd w:fill="F2EFE9"/>
+          </w:tcPr>
+          <w:p>
+            <w:pPr>
+              <w:spacing w:before="0" w:after="0" w:line="276" w:lineRule="auto"/>
+              <w:jc w:val="left"/>
+            </w:pPr>
+            <w:r/>
+            <w:r>
+              <w:rPr>
+                <w:rFonts w:ascii="Calibri" w:hAnsi="Calibri"/>
+                <w:b/>
+                <w:i w:val="0"/>
+                <w:color w:val="2F8B57"/>
+                <w:sz w:val="19"/>
+              </w:rPr>
+              <w:t>Open questions</w:t>
+            </w:r>
+          </w:p>
+        </w:tc>
+        <w:tc>
+          <w:tcPr>
+            <w:tcW w:type="dxa" w:w="7560"/>
+            <w:tcMar>
+              <w:top w:w="80" w:type="dxa"/>
+              <w:start w:w="120" w:type="dxa"/>
+              <w:bottom w:w="80" w:type="dxa"/>
+              <w:end w:w="120" w:type="dxa"/>
+            </w:tcMar>
+            <w:vAlign w:val="top"/>
+            <w:shd w:fill="FBFAF7"/>
+          </w:tcPr>
+          <w:p>
+            <w:pPr>
+              <w:spacing w:before="0" w:after="0" w:line="276" w:lineRule="auto"/>
+              <w:jc w:val="left"/>
+            </w:pPr>
+            <w:r/>
+            <w:r>
+              <w:rPr>
+                <w:rFonts w:ascii="Calibri" w:hAnsi="Calibri"/>
+                <w:b w:val="0"/>
+                <w:i/>
+                <w:color w:val="5F5A53"/>
+                <w:sz w:val="20"/>
+              </w:rPr>
+              <w:t>[questions to resolve]</w:t>
             </w:r>
           </w:p>
         </w:tc>
@@ -716,61 +1640,176 @@
       <w:tr>
         <w:tc>
           <w:tcPr>
-            <w:tcW w:type="dxa" w:w="2664"/>
+            <w:tcW w:type="dxa" w:w="1800"/>
             <w:tcMar>
-              <w:top w:w="100" w:type="dxa"/>
+              <w:top w:w="80" w:type="dxa"/>
               <w:start w:w="120" w:type="dxa"/>
-              <w:bottom w:w="100" w:type="dxa"/>
+              <w:bottom w:w="80" w:type="dxa"/>
               <w:end w:w="120" w:type="dxa"/>
             </w:tcMar>
-            <w:shd w:fill="F2F4F7"/>
-            <w:vAlign w:val="center"/>
+            <w:vAlign w:val="top"/>
+            <w:shd w:fill="F2EFE9"/>
           </w:tcPr>
           <w:p>
             <w:pPr>
-              <w:spacing w:after="0" w:before="0" w:line="276" w:lineRule="auto"/>
+              <w:spacing w:before="0" w:after="0" w:line="276" w:lineRule="auto"/>
               <w:jc w:val="left"/>
             </w:pPr>
             <w:r/>
             <w:r>
               <w:rPr>
-                <w:rFonts w:ascii="Calibri" w:hAnsi="Calibri" w:eastAsia="Calibri"/>
+                <w:rFonts w:ascii="Calibri" w:hAnsi="Calibri"/>
                 <w:b/>
                 <w:i w:val="0"/>
-                <w:color w:val="1F4D78"/>
-                <w:sz w:val="22"/>
+                <w:color w:val="2F8B57"/>
+                <w:sz w:val="19"/>
               </w:rPr>
-              <w:t>Acceptance criteria</w:t>
+              <w:t>Risks / notes</w:t>
             </w:r>
           </w:p>
         </w:tc>
         <w:tc>
           <w:tcPr>
-            <w:tcW w:type="dxa" w:w="6696"/>
+            <w:tcW w:type="dxa" w:w="7560"/>
             <w:tcMar>
-              <w:top w:w="100" w:type="dxa"/>
+              <w:top w:w="80" w:type="dxa"/>
               <w:start w:w="120" w:type="dxa"/>
-              <w:bottom w:w="100" w:type="dxa"/>
+              <w:bottom w:w="80" w:type="dxa"/>
               <w:end w:w="120" w:type="dxa"/>
             </w:tcMar>
-            <w:shd w:fill="E8EEF5"/>
-            <w:vAlign w:val="center"/>
+            <w:vAlign w:val="top"/>
+            <w:shd w:fill="FBFAF7"/>
           </w:tcPr>
           <w:p>
             <w:pPr>
-              <w:spacing w:after="0" w:before="0" w:line="276" w:lineRule="auto"/>
+              <w:spacing w:before="0" w:after="0" w:line="276" w:lineRule="auto"/>
               <w:jc w:val="left"/>
             </w:pPr>
             <w:r/>
             <w:r>
               <w:rPr>
-                <w:rFonts w:ascii="Calibri" w:hAnsi="Calibri" w:eastAsia="Calibri"/>
+                <w:rFonts w:ascii="Calibri" w:hAnsi="Calibri"/>
                 <w:b w:val="0"/>
                 <w:i/>
-                <w:color w:val="7A7A7A"/>
-                <w:sz w:val="22"/>
+                <w:color w:val="5F5A53"/>
+                <w:sz w:val="20"/>
               </w:rPr>
-              <w:t>Add 2-4 measurable conditions</w:t>
+              <w:t>[blockers, assumptions, or reminders]</w:t>
+            </w:r>
+          </w:p>
+        </w:tc>
+      </w:tr>
+    </w:tbl>
+    <w:p>
+      <w:pPr>
+        <w:spacing w:before="0" w:after="80" w:line="240" w:lineRule="auto"/>
+        <w:jc w:val="left"/>
+      </w:pPr>
+      <w:r>
+        <w:rPr>
+          <w:rFonts w:ascii="Calibri" w:hAnsi="Calibri"/>
+          <w:b/>
+          <w:i w:val="0"/>
+          <w:color w:val="2F8B57"/>
+          <w:sz w:val="19"/>
+        </w:rPr>
+        <w:t>Definition of done</w:t>
+      </w:r>
+    </w:p>
+    <w:p>
+      <w:pPr>
+        <w:spacing w:before="0" w:after="200" w:line="288" w:lineRule="auto"/>
+        <w:jc w:val="left"/>
+      </w:pPr>
+      <w:r>
+        <w:rPr>
+          <w:rFonts w:ascii="Calibri" w:hAnsi="Calibri"/>
+          <w:b w:val="0"/>
+          <w:i w:val="0"/>
+          <w:color w:val="5F5A53"/>
+          <w:sz w:val="21"/>
+        </w:rPr>
+        <w:t>Tick the boxes when the story is ready to move forward.</w:t>
+      </w:r>
+    </w:p>
+    <w:tbl>
+      <w:tblPr>
+        <w:tblW w:type="dxa" w:w="9360"/>
+        <w:jc w:val="center"/>
+        <w:tblLayout w:type="fixed"/>
+        <w:tblLook w:firstColumn="1" w:firstRow="1" w:lastColumn="0" w:lastRow="0" w:noHBand="0" w:noVBand="1" w:val="04A0"/>
+        <w:tblInd w:w="120" w:type="dxa"/>
+        <w:tblBorders>
+          <w:top w:val="single" w:sz="8" w:space="0" w:color="D9D5CE"/>
+          <w:left w:val="single" w:sz="8" w:space="0" w:color="D9D5CE"/>
+          <w:bottom w:val="single" w:sz="8" w:space="0" w:color="D9D5CE"/>
+          <w:right w:val="single" w:sz="8" w:space="0" w:color="D9D5CE"/>
+          <w:insideH w:val="single" w:sz="8" w:space="0" w:color="D9D5CE"/>
+          <w:insideV w:val="single" w:sz="8" w:space="0" w:color="D9D5CE"/>
+        </w:tblBorders>
+      </w:tblPr>
+      <w:tblGrid>
+        <w:gridCol w:w="792"/>
+        <w:gridCol w:w="8568"/>
+      </w:tblGrid>
+      <w:tr>
+        <w:tc>
+          <w:tcPr>
+            <w:tcW w:type="dxa" w:w="792"/>
+            <w:tcMar>
+              <w:top w:w="80" w:type="dxa"/>
+              <w:start w:w="120" w:type="dxa"/>
+              <w:bottom w:w="80" w:type="dxa"/>
+              <w:end w:w="120" w:type="dxa"/>
+            </w:tcMar>
+            <w:vAlign w:val="top"/>
+            <w:shd w:fill="F2EFE9"/>
+          </w:tcPr>
+          <w:p>
+            <w:pPr>
+              <w:spacing w:before="0" w:after="0" w:line="276" w:lineRule="auto"/>
+              <w:jc w:val="center"/>
+            </w:pPr>
+            <w:r/>
+            <w:r>
+              <w:rPr>
+                <w:rFonts w:ascii="Calibri" w:hAnsi="Calibri"/>
+                <w:b/>
+                <w:i w:val="0"/>
+                <w:color w:val="2F8B57"/>
+                <w:sz w:val="26"/>
+              </w:rPr>
+              <w:t>□</w:t>
+            </w:r>
+          </w:p>
+        </w:tc>
+        <w:tc>
+          <w:tcPr>
+            <w:tcW w:type="dxa" w:w="8568"/>
+            <w:tcMar>
+              <w:top w:w="80" w:type="dxa"/>
+              <w:start w:w="120" w:type="dxa"/>
+              <w:bottom w:w="80" w:type="dxa"/>
+              <w:end w:w="120" w:type="dxa"/>
+            </w:tcMar>
+            <w:vAlign w:val="top"/>
+            <w:shd w:fill="FBFAF7"/>
+          </w:tcPr>
+          <w:p>
+            <w:pPr>
+              <w:spacing w:before="0" w:after="0" w:line="276" w:lineRule="auto"/>
+              <w:jc w:val="left"/>
+            </w:pPr>
+            <w:r/>
+            <w:r>
+              <w:rPr>
+                <w:rFonts w:ascii="Calibri" w:hAnsi="Calibri"/>
+                <w:b w:val="0"/>
+                <w:i w:val="0"/>
+                <w:color w:val="111111"/>
+                <w:sz w:val="21"/>
+              </w:rPr>
+              <w:t>Reviewed with stakeholders</w:t>
             </w:r>
           </w:p>
         </w:tc>
@@ -778,121 +1817,220 @@
       <w:tr>
         <w:tc>
           <w:tcPr>
-            <w:tcW w:type="dxa" w:w="2664"/>
+            <w:tcW w:type="dxa" w:w="792"/>
             <w:tcMar>
-              <w:top w:w="100" w:type="dxa"/>
+              <w:top w:w="80" w:type="dxa"/>
               <w:start w:w="120" w:type="dxa"/>
-              <w:bottom w:w="100" w:type="dxa"/>
+              <w:bottom w:w="80" w:type="dxa"/>
               <w:end w:w="120" w:type="dxa"/>
             </w:tcMar>
-            <w:shd w:fill="F2F4F7"/>
-            <w:vAlign w:val="center"/>
+            <w:vAlign w:val="top"/>
+            <w:shd w:fill="F2EFE9"/>
           </w:tcPr>
           <w:p>
             <w:pPr>
-              <w:spacing w:after="0" w:before="0" w:line="276" w:lineRule="auto"/>
+              <w:spacing w:before="0" w:after="0" w:line="276" w:lineRule="auto"/>
+              <w:jc w:val="center"/>
+            </w:pPr>
+            <w:r/>
+            <w:r>
+              <w:rPr>
+                <w:rFonts w:ascii="Calibri" w:hAnsi="Calibri"/>
+                <w:b/>
+                <w:i w:val="0"/>
+                <w:color w:val="2F8B57"/>
+                <w:sz w:val="26"/>
+              </w:rPr>
+              <w:t>□</w:t>
+            </w:r>
+          </w:p>
+        </w:tc>
+        <w:tc>
+          <w:tcPr>
+            <w:tcW w:type="dxa" w:w="8568"/>
+            <w:tcMar>
+              <w:top w:w="80" w:type="dxa"/>
+              <w:start w:w="120" w:type="dxa"/>
+              <w:bottom w:w="80" w:type="dxa"/>
+              <w:end w:w="120" w:type="dxa"/>
+            </w:tcMar>
+            <w:vAlign w:val="top"/>
+            <w:shd w:fill="FBFAF7"/>
+          </w:tcPr>
+          <w:p>
+            <w:pPr>
+              <w:spacing w:before="0" w:after="0" w:line="276" w:lineRule="auto"/>
               <w:jc w:val="left"/>
             </w:pPr>
             <w:r/>
             <w:r>
               <w:rPr>
-                <w:rFonts w:ascii="Calibri" w:hAnsi="Calibri" w:eastAsia="Calibri"/>
+                <w:rFonts w:ascii="Calibri" w:hAnsi="Calibri"/>
+                <w:b w:val="0"/>
+                <w:i w:val="0"/>
+                <w:color w:val="111111"/>
+                <w:sz w:val="21"/>
+              </w:rPr>
+              <w:t>Acceptance criteria approved</w:t>
+            </w:r>
+          </w:p>
+        </w:tc>
+      </w:tr>
+      <w:tr>
+        <w:tc>
+          <w:tcPr>
+            <w:tcW w:type="dxa" w:w="792"/>
+            <w:tcMar>
+              <w:top w:w="80" w:type="dxa"/>
+              <w:start w:w="120" w:type="dxa"/>
+              <w:bottom w:w="80" w:type="dxa"/>
+              <w:end w:w="120" w:type="dxa"/>
+            </w:tcMar>
+            <w:vAlign w:val="top"/>
+            <w:shd w:fill="F2EFE9"/>
+          </w:tcPr>
+          <w:p>
+            <w:pPr>
+              <w:spacing w:before="0" w:after="0" w:line="276" w:lineRule="auto"/>
+              <w:jc w:val="center"/>
+            </w:pPr>
+            <w:r/>
+            <w:r>
+              <w:rPr>
+                <w:rFonts w:ascii="Calibri" w:hAnsi="Calibri"/>
                 <w:b/>
                 <w:i w:val="0"/>
-                <w:color w:val="1F4D78"/>
-                <w:sz w:val="22"/>
+                <w:color w:val="2F8B57"/>
+                <w:sz w:val="26"/>
               </w:rPr>
-              <w:t>Notes / dependencies</w:t>
+              <w:t>□</w:t>
             </w:r>
           </w:p>
         </w:tc>
         <w:tc>
           <w:tcPr>
-            <w:tcW w:type="dxa" w:w="6696"/>
+            <w:tcW w:type="dxa" w:w="8568"/>
             <w:tcMar>
-              <w:top w:w="100" w:type="dxa"/>
+              <w:top w:w="80" w:type="dxa"/>
               <w:start w:w="120" w:type="dxa"/>
-              <w:bottom w:w="100" w:type="dxa"/>
+              <w:bottom w:w="80" w:type="dxa"/>
               <w:end w:w="120" w:type="dxa"/>
             </w:tcMar>
-            <w:shd w:fill="F7FBFD"/>
-            <w:vAlign w:val="center"/>
+            <w:vAlign w:val="top"/>
+            <w:shd w:fill="FBFAF7"/>
           </w:tcPr>
           <w:p>
             <w:pPr>
-              <w:spacing w:after="0" w:before="0" w:line="276" w:lineRule="auto"/>
+              <w:spacing w:before="0" w:after="0" w:line="276" w:lineRule="auto"/>
               <w:jc w:val="left"/>
             </w:pPr>
             <w:r/>
             <w:r>
               <w:rPr>
-                <w:rFonts w:ascii="Calibri" w:hAnsi="Calibri" w:eastAsia="Calibri"/>
+                <w:rFonts w:ascii="Calibri" w:hAnsi="Calibri"/>
                 <w:b w:val="0"/>
-                <w:i/>
-                <w:color w:val="7A7A7A"/>
-                <w:sz w:val="22"/>
+                <w:i w:val="0"/>
+                <w:color w:val="111111"/>
+                <w:sz w:val="21"/>
               </w:rPr>
-              <w:t>Risks, questions, links, owners</w:t>
+              <w:t>Testing approach understood</w:t>
+            </w:r>
+          </w:p>
+        </w:tc>
+      </w:tr>
+      <w:tr>
+        <w:tc>
+          <w:tcPr>
+            <w:tcW w:type="dxa" w:w="792"/>
+            <w:tcMar>
+              <w:top w:w="80" w:type="dxa"/>
+              <w:start w:w="120" w:type="dxa"/>
+              <w:bottom w:w="80" w:type="dxa"/>
+              <w:end w:w="120" w:type="dxa"/>
+            </w:tcMar>
+            <w:vAlign w:val="top"/>
+            <w:shd w:fill="F2EFE9"/>
+          </w:tcPr>
+          <w:p>
+            <w:pPr>
+              <w:spacing w:before="0" w:after="0" w:line="276" w:lineRule="auto"/>
+              <w:jc w:val="center"/>
+            </w:pPr>
+            <w:r/>
+            <w:r>
+              <w:rPr>
+                <w:rFonts w:ascii="Calibri" w:hAnsi="Calibri"/>
+                <w:b/>
+                <w:i w:val="0"/>
+                <w:color w:val="2F8B57"/>
+                <w:sz w:val="26"/>
+              </w:rPr>
+              <w:t>□</w:t>
+            </w:r>
+          </w:p>
+        </w:tc>
+        <w:tc>
+          <w:tcPr>
+            <w:tcW w:type="dxa" w:w="8568"/>
+            <w:tcMar>
+              <w:top w:w="80" w:type="dxa"/>
+              <w:start w:w="120" w:type="dxa"/>
+              <w:bottom w:w="80" w:type="dxa"/>
+              <w:end w:w="120" w:type="dxa"/>
+            </w:tcMar>
+            <w:vAlign w:val="top"/>
+            <w:shd w:fill="FBFAF7"/>
+          </w:tcPr>
+          <w:p>
+            <w:pPr>
+              <w:spacing w:before="0" w:after="0" w:line="276" w:lineRule="auto"/>
+              <w:jc w:val="left"/>
+            </w:pPr>
+            <w:r/>
+            <w:r>
+              <w:rPr>
+                <w:rFonts w:ascii="Calibri" w:hAnsi="Calibri"/>
+                <w:b w:val="0"/>
+                <w:i w:val="0"/>
+                <w:color w:val="111111"/>
+                <w:sz w:val="21"/>
+              </w:rPr>
+              <w:t>Dependencies confirmed</w:t>
             </w:r>
           </w:p>
         </w:tc>
       </w:tr>
     </w:tbl>
-    <w:p/>
-    <w:tbl>
-      <w:tblPr>
-        <w:tblW w:type="auto" w:w="0"/>
+    <w:p>
+      <w:pPr>
+        <w:spacing w:before="0" w:after="0" w:line="300" w:lineRule="auto"/>
         <w:jc w:val="left"/>
-        <w:tblLayout w:type="fixed"/>
-        <w:tblLook w:firstColumn="1" w:firstRow="1" w:lastColumn="0" w:lastRow="0" w:noHBand="0" w:noVBand="1" w:val="04A0"/>
-        <w:tblBorders>
-          <w:top w:val="single" w:sz="10" w:space="0" w:color="67D98F"/>
-          <w:left w:val="single" w:sz="10" w:space="0" w:color="67D98F"/>
-          <w:bottom w:val="single" w:sz="10" w:space="0" w:color="67D98F"/>
-          <w:right w:val="single" w:sz="10" w:space="0" w:color="67D98F"/>
-          <w:insideH w:val="single" w:sz="10" w:space="0" w:color="67D98F"/>
-          <w:insideV w:val="single" w:sz="10" w:space="0" w:color="67D98F"/>
-        </w:tblBorders>
-      </w:tblPr>
-      <w:tblGrid>
-        <w:gridCol w:w="9360"/>
-      </w:tblGrid>
-      <w:tr>
-        <w:tc>
-          <w:tcPr>
-            <w:tcW w:type="dxa" w:w="9360"/>
-            <w:shd w:fill="F4FBF7"/>
-            <w:tcMar>
-              <w:top w:w="120" w:type="dxa"/>
-              <w:start w:w="160" w:type="dxa"/>
-              <w:bottom w:w="120" w:type="dxa"/>
-              <w:end w:w="160" w:type="dxa"/>
-            </w:tcMar>
-          </w:tcPr>
-          <w:p>
-            <w:pPr>
-              <w:spacing w:after="0" w:before="0" w:line="276" w:lineRule="auto"/>
-              <w:jc w:val="left"/>
-            </w:pPr>
-            <w:r/>
-            <w:r>
-              <w:rPr>
-                <w:rFonts w:ascii="Calibri" w:hAnsi="Calibri" w:eastAsia="Calibri"/>
-                <w:b w:val="0"/>
-                <w:i w:val="0"/>
-                <w:color w:val="111111"/>
-                <w:sz w:val="22"/>
-              </w:rPr>
-              <w:t>Tip: if the story starts to explain the solution in detail, pause and move the extra information into notes or acceptance criteria.</w:t>
-            </w:r>
-          </w:p>
-        </w:tc>
-      </w:tr>
-    </w:tbl>
+      </w:pPr>
+      <w:r>
+        <w:rPr>
+          <w:rFonts w:ascii="Calibri" w:hAnsi="Calibri"/>
+          <w:b/>
+          <w:i w:val="0"/>
+          <w:color w:val="2F8B57"/>
+          <w:sz w:val="20"/>
+        </w:rPr>
+        <w:t xml:space="preserve">Tip: </w:t>
+      </w:r>
+      <w:r>
+        <w:rPr>
+          <w:rFonts w:ascii="Calibri" w:hAnsi="Calibri"/>
+          <w:b w:val="0"/>
+          <w:i w:val="0"/>
+          <w:color w:val="5F5A53"/>
+          <w:sz w:val="20"/>
+        </w:rPr>
+        <w:t>delete the bracketed prompts before you share the template.</w:t>
+      </w:r>
+    </w:p>
     <w:sectPr>
       <w:footerReference w:type="default" r:id="rId9"/>
       <w:pgSz w:w="12240" w:h="15840"/>
-      <w:pgMar w:top="1440" w:right="1440" w:bottom="1440" w:left="1440" w:header="708" w:footer="708" w:gutter="0"/>
+      <w:pgMar w:top="1440" w:right="1440" w:bottom="1440" w:left="1440" w:header="648" w:footer="648" w:gutter="0"/>
       <w:cols w:space="720"/>
       <w:docGrid w:linePitch="360"/>
     </w:sectPr>
@@ -905,15 +2043,18 @@
   <w:p>
     <w:pPr>
       <w:pStyle w:val="Footer"/>
+      <w:spacing w:before="0" w:after="0" w:line="240" w:lineRule="auto"/>
       <w:jc w:val="center"/>
     </w:pPr>
     <w:r>
       <w:rPr>
-        <w:rFonts w:ascii="Calibri" w:hAnsi="Calibri" w:eastAsia="Calibri"/>
+        <w:rFonts w:ascii="Calibri" w:hAnsi="Calibri"/>
+        <w:b w:val="0"/>
+        <w:i w:val="0"/>
         <w:color w:val="5F5A53"/>
         <w:sz w:val="18"/>
       </w:rPr>
-      <w:t>Viviane Santos | Business Analyst</w:t>
+      <w:t>Viviane Santos | Business Analyst | User Story Template</w:t>
     </w:r>
   </w:p>
 </w:ftr>
@@ -1282,11 +2423,9 @@
     <w:name w:val="Normal"/>
     <w:qFormat/>
     <w:rsid w:val="00FC693F"/>
-    <w:pPr>
-      <w:spacing w:after="120" w:line="300" w:lineRule="auto"/>
-    </w:pPr>
     <w:rPr>
-      <w:rFonts w:ascii="Calibri" w:hAnsi="Calibri" w:eastAsia="Calibri"/>
+      <w:rFonts w:ascii="Calibri" w:hAnsi="Calibri"/>
+      <w:color w:val="111111"/>
       <w:sz w:val="22"/>
     </w:rPr>
   </w:style>
@@ -1349,11 +2488,11 @@
       <w:outlineLvl w:val="0"/>
     </w:pPr>
     <w:rPr>
-      <w:rFonts w:asciiTheme="majorHAnsi" w:eastAsiaTheme="majorEastAsia" w:hAnsiTheme="majorHAnsi" w:cstheme="majorBidi" w:ascii="Calibri" w:hAnsi="Calibri" w:eastAsia="Calibri"/>
+      <w:rFonts w:asciiTheme="majorHAnsi" w:eastAsiaTheme="majorEastAsia" w:hAnsiTheme="majorHAnsi" w:cstheme="majorBidi"/>
       <w:b/>
       <w:bCs/>
-      <w:color w:val="2E74B5"/>
-      <w:sz w:val="32"/>
+      <w:color w:val="365F91" w:themeColor="accent1" w:themeShade="BF"/>
+      <w:sz w:val="28"/>
       <w:szCs w:val="28"/>
     </w:rPr>
   </w:style>
@@ -1373,10 +2512,10 @@
       <w:outlineLvl w:val="1"/>
     </w:pPr>
     <w:rPr>
-      <w:rFonts w:asciiTheme="majorHAnsi" w:eastAsiaTheme="majorEastAsia" w:hAnsiTheme="majorHAnsi" w:cstheme="majorBidi" w:ascii="Calibri" w:hAnsi="Calibri" w:eastAsia="Calibri"/>
+      <w:rFonts w:asciiTheme="majorHAnsi" w:eastAsiaTheme="majorEastAsia" w:hAnsiTheme="majorHAnsi" w:cstheme="majorBidi"/>
       <w:b/>
       <w:bCs/>
-      <w:color w:val="2E74B5"/>
+      <w:color w:val="4F81BD" w:themeColor="accent1"/>
       <w:sz w:val="26"/>
       <w:szCs w:val="26"/>
     </w:rPr>
@@ -1397,11 +2536,10 @@
       <w:outlineLvl w:val="2"/>
     </w:pPr>
     <w:rPr>
-      <w:rFonts w:asciiTheme="majorHAnsi" w:eastAsiaTheme="majorEastAsia" w:hAnsiTheme="majorHAnsi" w:cstheme="majorBidi" w:ascii="Calibri" w:hAnsi="Calibri" w:eastAsia="Calibri"/>
+      <w:rFonts w:asciiTheme="majorHAnsi" w:eastAsiaTheme="majorEastAsia" w:hAnsiTheme="majorHAnsi" w:cstheme="majorBidi"/>
       <w:b/>
       <w:bCs/>
-      <w:color w:val="1F4D78"/>
-      <w:sz w:val="24"/>
+      <w:color w:val="4F81BD" w:themeColor="accent1"/>
     </w:rPr>
   </w:style>
   <w:style w:type="paragraph" w:styleId="Heading4">
@@ -1639,12 +2777,11 @@
       <w:contextualSpacing/>
     </w:pPr>
     <w:rPr>
-      <w:rFonts w:asciiTheme="majorHAnsi" w:eastAsiaTheme="majorEastAsia" w:hAnsiTheme="majorHAnsi" w:cstheme="majorBidi" w:ascii="Calibri" w:hAnsi="Calibri" w:eastAsia="Calibri"/>
-      <w:b/>
-      <w:color w:val="000000"/>
+      <w:rFonts w:asciiTheme="majorHAnsi" w:eastAsiaTheme="majorEastAsia" w:hAnsiTheme="majorHAnsi" w:cstheme="majorBidi"/>
+      <w:color w:val="17365D" w:themeColor="text2" w:themeShade="BF"/>
       <w:spacing w:val="5"/>
       <w:kern w:val="28"/>
-      <w:sz w:val="48"/>
+      <w:sz w:val="52"/>
       <w:szCs w:val="52"/>
     </w:rPr>
   </w:style>

</xml_diff>